<commit_message>
add part 4,5, 7
</commit_message>
<xml_diff>
--- a/COMP3059-Project Vision Template.docx
+++ b/COMP3059-Project Vision Template.docx
@@ -34,7 +34,7 @@
               </w:tcPr>
               <w:p>
                 <w:pPr>
-                  <w:pStyle w:val="186"/>
+                  <w:pStyle w:val="219"/>
                   <w:jc w:val="right"/>
                   <w:rPr>
                     <w:rFonts w:ascii="Arial" w:hAnsi="Arial" w:cs="Arial" w:eastAsia="Cambria"/>
@@ -72,7 +72,7 @@
               </w:tcPr>
               <w:p>
                 <w:pPr>
-                  <w:pStyle w:val="186"/>
+                  <w:pStyle w:val="219"/>
                   <w:jc w:val="right"/>
                   <w:rPr>
                     <w:rFonts w:ascii="Arial" w:hAnsi="Arial" w:cs="Arial" w:eastAsia="Cambria"/>
@@ -111,7 +111,7 @@
               </w:tcPr>
               <w:p>
                 <w:pPr>
-                  <w:pStyle w:val="186"/>
+                  <w:pStyle w:val="219"/>
                   <w:jc w:val="right"/>
                   <w:rPr>
                     <w:rFonts w:ascii="Arial" w:hAnsi="Arial" w:cs="Arial" w:eastAsia="Cambria"/>
@@ -147,7 +147,7 @@
               </w:tcPr>
               <w:p>
                 <w:pPr>
-                  <w:pStyle w:val="186"/>
+                  <w:pStyle w:val="219"/>
                   <w:jc w:val="right"/>
                   <w:rPr>
                     <w:rFonts w:ascii="Arial" w:hAnsi="Arial" w:cs="Arial"/>
@@ -182,7 +182,7 @@
               </w:tcPr>
               <w:p>
                 <w:pPr>
-                  <w:pStyle w:val="186"/>
+                  <w:pStyle w:val="219"/>
                   <w:jc w:val="right"/>
                   <w:rPr>
                     <w:rFonts w:ascii="Arial" w:hAnsi="Arial" w:cs="Arial"/>
@@ -219,7 +219,7 @@
     </w:sdt>
     <w:p>
       <w:pPr>
-        <w:pStyle w:val="190"/>
+        <w:pStyle w:val="223"/>
         <w:rPr>
           <w:rFonts w:ascii="Arial" w:hAnsi="Arial" w:cs="Arial"/>
           <w:b/>
@@ -238,7 +238,7 @@
     </w:p>
     <w:tbl>
       <w:tblPr>
-        <w:tblStyle w:val="194"/>
+        <w:tblStyle w:val="227"/>
         <w:tblW w:w="0" w:type="auto"/>
         <w:tblLook w:val="04A0" w:firstRow="1" w:lastRow="0" w:firstColumn="1" w:lastColumn="0" w:noHBand="0" w:noVBand="1"/>
       </w:tblPr>
@@ -687,7 +687,7 @@
     </w:p>
     <w:p>
       <w:pPr>
-        <w:pStyle w:val="190"/>
+        <w:pStyle w:val="223"/>
         <w:rPr>
           <w:rFonts w:ascii="Arial" w:hAnsi="Arial" w:cs="Arial"/>
           <w:b/>
@@ -706,7 +706,7 @@
     </w:p>
     <w:tbl>
       <w:tblPr>
-        <w:tblStyle w:val="194"/>
+        <w:tblStyle w:val="227"/>
         <w:tblW w:w="9606" w:type="dxa"/>
         <w:tblLook w:val="04A0" w:firstRow="1" w:lastRow="0" w:firstColumn="1" w:lastColumn="0" w:noHBand="0" w:noVBand="1"/>
       </w:tblPr>
@@ -792,7 +792,7 @@
           </w:tcPr>
           <w:p>
             <w:pPr>
-              <w:ind w:left="-107"/>
+              <w:ind w:left="-106"/>
               <w:rPr>
                 <w:rFonts w:cs="Arial"/>
                 <w:b w:val="false"/>
@@ -1060,7 +1060,7 @@
     </w:tbl>
     <w:p>
       <w:pPr>
-        <w:pStyle w:val="190"/>
+        <w:pStyle w:val="223"/>
         <w:rPr>
           <w:rFonts w:ascii="Arial" w:hAnsi="Arial" w:cs="Arial"/>
           <w:b/>
@@ -1078,7 +1078,7 @@
     </w:p>
     <w:p>
       <w:pPr>
-        <w:pStyle w:val="190"/>
+        <w:pStyle w:val="223"/>
         <w:rPr>
           <w:rFonts w:ascii="Arial" w:hAnsi="Arial" w:cs="Arial"/>
           <w:b/>
@@ -1097,7 +1097,7 @@
     </w:p>
     <w:tbl>
       <w:tblPr>
-        <w:tblStyle w:val="194"/>
+        <w:tblStyle w:val="227"/>
         <w:tblW w:w="9606" w:type="dxa"/>
         <w:tblLook w:val="04A0" w:firstRow="1" w:lastRow="0" w:firstColumn="1" w:lastColumn="0" w:noHBand="0" w:noVBand="1"/>
       </w:tblPr>
@@ -1160,7 +1160,7 @@
           </w:tcPr>
           <w:p>
             <w:pPr>
-              <w:ind w:left="-107"/>
+              <w:ind w:left="-106"/>
               <w:rPr>
                 <w:rFonts w:cs="Arial"/>
                 <w:b w:val="false"/>
@@ -1411,7 +1411,7 @@
       <w:sdtContent>
         <w:p>
           <w:pPr>
-            <w:pStyle w:val="210"/>
+            <w:pStyle w:val="243"/>
             <w:jc w:val="center"/>
             <w:rPr>
               <w:rFonts w:ascii="Arial" w:hAnsi="Arial" w:cs="Arial"/>
@@ -1429,7 +1429,7 @@
         </w:p>
         <w:p>
           <w:pPr>
-            <w:pStyle w:val="211"/>
+            <w:pStyle w:val="244"/>
             <w:jc w:val="center"/>
             <w:tabs>
               <w:tab w:val="left" w:pos="440" w:leader="none"/>
@@ -1460,7 +1460,7 @@
           <w:hyperlink r:id="rId10" w:tooltip="Current Document" w:anchor="_Toc328744998" w:history="1">
             <w:r>
               <w:rPr>
-                <w:rStyle w:val="214"/>
+                <w:rStyle w:val="247"/>
                 <w:rFonts w:ascii="Arial" w:hAnsi="Arial" w:cs="Arial"/>
                 <w:color w:val="auto"/>
               </w:rPr>
@@ -1474,7 +1474,7 @@
             </w:r>
             <w:r>
               <w:rPr>
-                <w:rStyle w:val="214"/>
+                <w:rStyle w:val="247"/>
                 <w:rFonts w:ascii="Arial" w:hAnsi="Arial" w:cs="Arial"/>
                 <w:color w:val="auto"/>
               </w:rPr>
@@ -1527,7 +1527,7 @@
         </w:p>
         <w:p>
           <w:pPr>
-            <w:pStyle w:val="212"/>
+            <w:pStyle w:val="245"/>
             <w:jc w:val="center"/>
             <w:tabs>
               <w:tab w:val="left" w:pos="880" w:leader="none"/>
@@ -1541,7 +1541,7 @@
           <w:hyperlink r:id="rId11" w:tooltip="Current Document" w:anchor="_Toc328744999" w:history="1">
             <w:r>
               <w:rPr>
-                <w:rStyle w:val="214"/>
+                <w:rStyle w:val="247"/>
                 <w:rFonts w:ascii="Arial" w:hAnsi="Arial" w:cs="Arial"/>
                 <w:color w:val="auto"/>
               </w:rPr>
@@ -1555,7 +1555,7 @@
             </w:r>
             <w:r>
               <w:rPr>
-                <w:rStyle w:val="214"/>
+                <w:rStyle w:val="247"/>
                 <w:rFonts w:ascii="Arial" w:hAnsi="Arial" w:cs="Arial"/>
                 <w:color w:val="auto"/>
               </w:rPr>
@@ -1608,7 +1608,7 @@
         </w:p>
         <w:p>
           <w:pPr>
-            <w:pStyle w:val="212"/>
+            <w:pStyle w:val="245"/>
             <w:jc w:val="center"/>
             <w:tabs>
               <w:tab w:val="left" w:pos="880" w:leader="none"/>
@@ -1622,7 +1622,7 @@
           <w:hyperlink r:id="rId12" w:tooltip="Current Document" w:anchor="_Toc328745000" w:history="1">
             <w:r>
               <w:rPr>
-                <w:rStyle w:val="214"/>
+                <w:rStyle w:val="247"/>
                 <w:rFonts w:ascii="Arial" w:hAnsi="Arial" w:cs="Arial"/>
                 <w:color w:val="auto"/>
               </w:rPr>
@@ -1636,7 +1636,7 @@
             </w:r>
             <w:r>
               <w:rPr>
-                <w:rStyle w:val="214"/>
+                <w:rStyle w:val="247"/>
                 <w:rFonts w:ascii="Arial" w:hAnsi="Arial" w:cs="Arial"/>
                 <w:color w:val="auto"/>
               </w:rPr>
@@ -1689,7 +1689,7 @@
         </w:p>
         <w:p>
           <w:pPr>
-            <w:pStyle w:val="213"/>
+            <w:pStyle w:val="246"/>
             <w:jc w:val="center"/>
             <w:tabs>
               <w:tab w:val="left" w:pos="1320" w:leader="none"/>
@@ -1703,7 +1703,7 @@
           <w:hyperlink r:id="rId13" w:tooltip="Current Document" w:anchor="_Toc328745001" w:history="1">
             <w:r>
               <w:rPr>
-                <w:rStyle w:val="214"/>
+                <w:rStyle w:val="247"/>
                 <w:rFonts w:ascii="Arial" w:hAnsi="Arial" w:cs="Arial"/>
                 <w:color w:val="auto"/>
               </w:rPr>
@@ -1717,7 +1717,7 @@
             </w:r>
             <w:r>
               <w:rPr>
-                <w:rStyle w:val="214"/>
+                <w:rStyle w:val="247"/>
                 <w:rFonts w:ascii="Arial" w:hAnsi="Arial" w:cs="Arial"/>
                 <w:color w:val="auto"/>
               </w:rPr>
@@ -1770,7 +1770,7 @@
         </w:p>
         <w:p>
           <w:pPr>
-            <w:pStyle w:val="213"/>
+            <w:pStyle w:val="246"/>
             <w:jc w:val="center"/>
             <w:tabs>
               <w:tab w:val="left" w:pos="1320" w:leader="none"/>
@@ -1784,7 +1784,7 @@
           <w:hyperlink r:id="rId14" w:tooltip="Current Document" w:anchor="_Toc328745002" w:history="1">
             <w:r>
               <w:rPr>
-                <w:rStyle w:val="214"/>
+                <w:rStyle w:val="247"/>
                 <w:rFonts w:ascii="Arial" w:hAnsi="Arial" w:cs="Arial"/>
                 <w:color w:val="auto"/>
               </w:rPr>
@@ -1798,7 +1798,7 @@
             </w:r>
             <w:r>
               <w:rPr>
-                <w:rStyle w:val="214"/>
+                <w:rStyle w:val="247"/>
                 <w:rFonts w:ascii="Arial" w:hAnsi="Arial" w:cs="Arial"/>
                 <w:color w:val="auto"/>
               </w:rPr>
@@ -1851,7 +1851,7 @@
         </w:p>
         <w:p>
           <w:pPr>
-            <w:pStyle w:val="212"/>
+            <w:pStyle w:val="245"/>
             <w:jc w:val="center"/>
             <w:tabs>
               <w:tab w:val="left" w:pos="880" w:leader="none"/>
@@ -1865,7 +1865,7 @@
           <w:hyperlink r:id="rId15" w:tooltip="Current Document" w:anchor="_Toc328745003" w:history="1">
             <w:r>
               <w:rPr>
-                <w:rStyle w:val="214"/>
+                <w:rStyle w:val="247"/>
                 <w:rFonts w:ascii="Arial" w:hAnsi="Arial" w:cs="Arial"/>
                 <w:color w:val="auto"/>
               </w:rPr>
@@ -1879,7 +1879,7 @@
             </w:r>
             <w:r>
               <w:rPr>
-                <w:rStyle w:val="214"/>
+                <w:rStyle w:val="247"/>
                 <w:rFonts w:ascii="Arial" w:hAnsi="Arial" w:cs="Arial"/>
                 <w:color w:val="auto"/>
               </w:rPr>
@@ -1932,7 +1932,7 @@
         </w:p>
         <w:p>
           <w:pPr>
-            <w:pStyle w:val="212"/>
+            <w:pStyle w:val="245"/>
             <w:jc w:val="center"/>
             <w:tabs>
               <w:tab w:val="left" w:pos="880" w:leader="none"/>
@@ -1946,7 +1946,7 @@
           <w:hyperlink r:id="rId16" w:tooltip="Current Document" w:anchor="_Toc328745004" w:history="1">
             <w:r>
               <w:rPr>
-                <w:rStyle w:val="214"/>
+                <w:rStyle w:val="247"/>
                 <w:rFonts w:ascii="Arial" w:hAnsi="Arial" w:cs="Arial"/>
                 <w:color w:val="auto"/>
               </w:rPr>
@@ -1960,7 +1960,7 @@
             </w:r>
             <w:r>
               <w:rPr>
-                <w:rStyle w:val="214"/>
+                <w:rStyle w:val="247"/>
                 <w:rFonts w:ascii="Arial" w:hAnsi="Arial" w:cs="Arial"/>
                 <w:color w:val="auto"/>
               </w:rPr>
@@ -2013,7 +2013,7 @@
         </w:p>
         <w:p>
           <w:pPr>
-            <w:pStyle w:val="211"/>
+            <w:pStyle w:val="244"/>
             <w:jc w:val="center"/>
             <w:tabs>
               <w:tab w:val="left" w:pos="440" w:leader="none"/>
@@ -2027,7 +2027,7 @@
           <w:hyperlink r:id="rId17" w:tooltip="Current Document" w:anchor="_Toc328745005" w:history="1">
             <w:r>
               <w:rPr>
-                <w:rStyle w:val="214"/>
+                <w:rStyle w:val="247"/>
                 <w:rFonts w:ascii="Arial" w:hAnsi="Arial" w:cs="Arial"/>
                 <w:color w:val="auto"/>
               </w:rPr>
@@ -2041,7 +2041,7 @@
             </w:r>
             <w:r>
               <w:rPr>
-                <w:rStyle w:val="214"/>
+                <w:rStyle w:val="247"/>
                 <w:rFonts w:ascii="Arial" w:hAnsi="Arial" w:cs="Arial"/>
                 <w:color w:val="auto"/>
               </w:rPr>
@@ -2094,7 +2094,7 @@
         </w:p>
         <w:p>
           <w:pPr>
-            <w:pStyle w:val="212"/>
+            <w:pStyle w:val="245"/>
             <w:jc w:val="center"/>
             <w:tabs>
               <w:tab w:val="left" w:pos="880" w:leader="none"/>
@@ -2108,7 +2108,7 @@
           <w:hyperlink r:id="rId18" w:tooltip="Current Document" w:anchor="_Toc328745006" w:history="1">
             <w:r>
               <w:rPr>
-                <w:rStyle w:val="214"/>
+                <w:rStyle w:val="247"/>
                 <w:rFonts w:ascii="Arial" w:hAnsi="Arial" w:cs="Arial"/>
                 <w:color w:val="auto"/>
               </w:rPr>
@@ -2122,7 +2122,7 @@
             </w:r>
             <w:r>
               <w:rPr>
-                <w:rStyle w:val="214"/>
+                <w:rStyle w:val="247"/>
                 <w:rFonts w:ascii="Arial" w:hAnsi="Arial" w:cs="Arial"/>
                 <w:color w:val="auto"/>
               </w:rPr>
@@ -2175,7 +2175,7 @@
         </w:p>
         <w:p>
           <w:pPr>
-            <w:pStyle w:val="212"/>
+            <w:pStyle w:val="245"/>
             <w:jc w:val="center"/>
             <w:tabs>
               <w:tab w:val="left" w:pos="880" w:leader="none"/>
@@ -2189,7 +2189,7 @@
           <w:hyperlink r:id="rId19" w:tooltip="Current Document" w:anchor="_Toc328745007" w:history="1">
             <w:r>
               <w:rPr>
-                <w:rStyle w:val="214"/>
+                <w:rStyle w:val="247"/>
                 <w:rFonts w:ascii="Arial" w:hAnsi="Arial" w:cs="Arial"/>
                 <w:color w:val="auto"/>
               </w:rPr>
@@ -2203,7 +2203,7 @@
             </w:r>
             <w:r>
               <w:rPr>
-                <w:rStyle w:val="214"/>
+                <w:rStyle w:val="247"/>
                 <w:rFonts w:ascii="Arial" w:hAnsi="Arial" w:cs="Arial"/>
                 <w:color w:val="auto"/>
               </w:rPr>
@@ -2256,7 +2256,7 @@
         </w:p>
         <w:p>
           <w:pPr>
-            <w:pStyle w:val="212"/>
+            <w:pStyle w:val="245"/>
             <w:jc w:val="center"/>
             <w:tabs>
               <w:tab w:val="left" w:pos="880" w:leader="none"/>
@@ -2270,7 +2270,7 @@
           <w:hyperlink r:id="rId20" w:tooltip="Current Document" w:anchor="_Toc328745008" w:history="1">
             <w:r>
               <w:rPr>
-                <w:rStyle w:val="214"/>
+                <w:rStyle w:val="247"/>
                 <w:rFonts w:ascii="Arial" w:hAnsi="Arial" w:cs="Arial"/>
                 <w:color w:val="auto"/>
               </w:rPr>
@@ -2284,7 +2284,7 @@
             </w:r>
             <w:r>
               <w:rPr>
-                <w:rStyle w:val="214"/>
+                <w:rStyle w:val="247"/>
                 <w:rFonts w:ascii="Arial" w:hAnsi="Arial" w:cs="Arial"/>
                 <w:color w:val="auto"/>
               </w:rPr>
@@ -2337,7 +2337,7 @@
         </w:p>
         <w:p>
           <w:pPr>
-            <w:pStyle w:val="211"/>
+            <w:pStyle w:val="244"/>
             <w:jc w:val="center"/>
             <w:tabs>
               <w:tab w:val="left" w:pos="440" w:leader="none"/>
@@ -2351,7 +2351,7 @@
           <w:hyperlink r:id="rId21" w:tooltip="Current Document" w:anchor="_Toc328745009" w:history="1">
             <w:r>
               <w:rPr>
-                <w:rStyle w:val="214"/>
+                <w:rStyle w:val="247"/>
                 <w:rFonts w:ascii="Arial" w:hAnsi="Arial" w:cs="Arial"/>
                 <w:color w:val="auto"/>
               </w:rPr>
@@ -2365,7 +2365,7 @@
             </w:r>
             <w:r>
               <w:rPr>
-                <w:rStyle w:val="214"/>
+                <w:rStyle w:val="247"/>
                 <w:rFonts w:ascii="Arial" w:hAnsi="Arial" w:cs="Arial"/>
                 <w:color w:val="auto"/>
               </w:rPr>
@@ -2418,7 +2418,7 @@
         </w:p>
         <w:p>
           <w:pPr>
-            <w:pStyle w:val="212"/>
+            <w:pStyle w:val="245"/>
             <w:jc w:val="center"/>
             <w:tabs>
               <w:tab w:val="left" w:pos="880" w:leader="none"/>
@@ -2432,7 +2432,7 @@
           <w:hyperlink r:id="rId22" w:tooltip="Current Document" w:anchor="_Toc328745010" w:history="1">
             <w:r>
               <w:rPr>
-                <w:rStyle w:val="214"/>
+                <w:rStyle w:val="247"/>
                 <w:rFonts w:ascii="Arial" w:hAnsi="Arial" w:cs="Arial"/>
                 <w:color w:val="auto"/>
               </w:rPr>
@@ -2446,7 +2446,7 @@
             </w:r>
             <w:r>
               <w:rPr>
-                <w:rStyle w:val="214"/>
+                <w:rStyle w:val="247"/>
                 <w:rFonts w:ascii="Arial" w:hAnsi="Arial" w:cs="Arial"/>
                 <w:color w:val="auto"/>
               </w:rPr>
@@ -2499,7 +2499,7 @@
         </w:p>
         <w:p>
           <w:pPr>
-            <w:pStyle w:val="212"/>
+            <w:pStyle w:val="245"/>
             <w:jc w:val="center"/>
             <w:tabs>
               <w:tab w:val="left" w:pos="880" w:leader="none"/>
@@ -2513,7 +2513,7 @@
           <w:hyperlink r:id="rId23" w:tooltip="Current Document" w:anchor="_Toc328745011" w:history="1">
             <w:r>
               <w:rPr>
-                <w:rStyle w:val="214"/>
+                <w:rStyle w:val="247"/>
                 <w:rFonts w:ascii="Arial" w:hAnsi="Arial" w:cs="Arial"/>
                 <w:color w:val="auto"/>
               </w:rPr>
@@ -2527,7 +2527,7 @@
             </w:r>
             <w:r>
               <w:rPr>
-                <w:rStyle w:val="214"/>
+                <w:rStyle w:val="247"/>
                 <w:rFonts w:ascii="Arial" w:hAnsi="Arial" w:cs="Arial"/>
                 <w:color w:val="auto"/>
               </w:rPr>
@@ -2580,7 +2580,7 @@
         </w:p>
         <w:p>
           <w:pPr>
-            <w:pStyle w:val="211"/>
+            <w:pStyle w:val="244"/>
             <w:jc w:val="center"/>
             <w:tabs>
               <w:tab w:val="left" w:pos="440" w:leader="none"/>
@@ -2594,7 +2594,7 @@
           <w:hyperlink r:id="rId24" w:tooltip="Current Document" w:anchor="_Toc328745012" w:history="1">
             <w:r>
               <w:rPr>
-                <w:rStyle w:val="214"/>
+                <w:rStyle w:val="247"/>
                 <w:rFonts w:ascii="Arial" w:hAnsi="Arial" w:cs="Arial"/>
                 <w:color w:val="auto"/>
               </w:rPr>
@@ -2608,7 +2608,7 @@
             </w:r>
             <w:r>
               <w:rPr>
-                <w:rStyle w:val="214"/>
+                <w:rStyle w:val="247"/>
                 <w:rFonts w:ascii="Arial" w:hAnsi="Arial" w:cs="Arial"/>
                 <w:color w:val="auto"/>
               </w:rPr>
@@ -2661,7 +2661,7 @@
         </w:p>
         <w:p>
           <w:pPr>
-            <w:pStyle w:val="211"/>
+            <w:pStyle w:val="244"/>
             <w:jc w:val="center"/>
             <w:tabs>
               <w:tab w:val="left" w:pos="440" w:leader="none"/>
@@ -2675,7 +2675,7 @@
           <w:hyperlink r:id="rId25" w:tooltip="Current Document" w:anchor="_Toc328745013" w:history="1">
             <w:r>
               <w:rPr>
-                <w:rStyle w:val="214"/>
+                <w:rStyle w:val="247"/>
                 <w:rFonts w:ascii="Arial" w:hAnsi="Arial" w:cs="Arial"/>
                 <w:color w:val="auto"/>
               </w:rPr>
@@ -2689,7 +2689,7 @@
             </w:r>
             <w:r>
               <w:rPr>
-                <w:rStyle w:val="214"/>
+                <w:rStyle w:val="247"/>
                 <w:rFonts w:ascii="Arial" w:hAnsi="Arial" w:cs="Arial"/>
                 <w:color w:val="auto"/>
               </w:rPr>
@@ -2742,7 +2742,7 @@
         </w:p>
         <w:p>
           <w:pPr>
-            <w:pStyle w:val="211"/>
+            <w:pStyle w:val="244"/>
             <w:jc w:val="center"/>
             <w:tabs>
               <w:tab w:val="left" w:pos="440" w:leader="none"/>
@@ -2756,7 +2756,7 @@
           <w:hyperlink r:id="rId26" w:tooltip="Current Document" w:anchor="_Toc328745014" w:history="1">
             <w:r>
               <w:rPr>
-                <w:rStyle w:val="214"/>
+                <w:rStyle w:val="247"/>
                 <w:rFonts w:ascii="Arial" w:hAnsi="Arial" w:cs="Arial"/>
                 <w:color w:val="auto"/>
               </w:rPr>
@@ -2770,7 +2770,7 @@
             </w:r>
             <w:r>
               <w:rPr>
-                <w:rStyle w:val="214"/>
+                <w:rStyle w:val="247"/>
                 <w:rFonts w:ascii="Arial" w:hAnsi="Arial" w:cs="Arial"/>
                 <w:color w:val="auto"/>
               </w:rPr>
@@ -2823,7 +2823,7 @@
         </w:p>
         <w:p>
           <w:pPr>
-            <w:pStyle w:val="211"/>
+            <w:pStyle w:val="244"/>
             <w:jc w:val="center"/>
             <w:tabs>
               <w:tab w:val="left" w:pos="440" w:leader="none"/>
@@ -2837,7 +2837,7 @@
           <w:hyperlink r:id="rId27" w:tooltip="Current Document" w:anchor="_Toc328745015" w:history="1">
             <w:r>
               <w:rPr>
-                <w:rStyle w:val="214"/>
+                <w:rStyle w:val="247"/>
                 <w:rFonts w:ascii="Arial" w:hAnsi="Arial" w:cs="Arial"/>
                 <w:color w:val="auto"/>
               </w:rPr>
@@ -2851,7 +2851,7 @@
             </w:r>
             <w:r>
               <w:rPr>
-                <w:rStyle w:val="214"/>
+                <w:rStyle w:val="247"/>
                 <w:rFonts w:ascii="Arial" w:hAnsi="Arial" w:cs="Arial"/>
                 <w:color w:val="auto"/>
               </w:rPr>
@@ -2939,7 +2939,7 @@
     </w:p>
     <w:p>
       <w:pPr>
-        <w:pStyle w:val="170"/>
+        <w:pStyle w:val="203"/>
         <w:spacing w:lineRule="auto" w:line="360"/>
         <w:rPr>
           <w:rFonts w:cs="Arial"/>
@@ -2973,7 +2973,7 @@
     </w:p>
     <w:p>
       <w:pPr>
-        <w:pStyle w:val="171"/>
+        <w:pStyle w:val="204"/>
         <w:spacing w:after="240"/>
         <w:rPr>
           <w:rFonts w:cs="Arial"/>
@@ -3007,7 +3007,7 @@
     </w:p>
     <w:p>
       <w:pPr>
-        <w:pStyle w:val="171"/>
+        <w:pStyle w:val="204"/>
         <w:spacing w:after="240"/>
         <w:rPr>
           <w:rFonts w:cs="Arial"/>
@@ -3042,7 +3042,7 @@
     </w:p>
     <w:p>
       <w:pPr>
-        <w:pStyle w:val="172"/>
+        <w:pStyle w:val="205"/>
         <w:rPr>
           <w:rFonts w:cs="Arial"/>
         </w:rPr>
@@ -3061,7 +3061,7 @@
     </w:p>
     <w:p>
       <w:pPr>
-        <w:pStyle w:val="216"/>
+        <w:pStyle w:val="249"/>
         <w:numPr>
           <w:ilvl w:val="0"/>
           <w:numId w:val="1"/>
@@ -3077,14 +3077,14 @@
     </w:p>
     <w:p>
       <w:pPr>
-        <w:pStyle w:val="216"/>
+        <w:pStyle w:val="249"/>
       </w:pPr>
       <w:r/>
       <w:r/>
     </w:p>
     <w:p>
       <w:pPr>
-        <w:pStyle w:val="216"/>
+        <w:pStyle w:val="249"/>
         <w:numPr>
           <w:ilvl w:val="0"/>
           <w:numId w:val="1"/>
@@ -3100,14 +3100,14 @@
     </w:p>
     <w:p>
       <w:pPr>
-        <w:pStyle w:val="216"/>
+        <w:pStyle w:val="249"/>
       </w:pPr>
       <w:r/>
       <w:r/>
     </w:p>
     <w:p>
       <w:pPr>
-        <w:pStyle w:val="172"/>
+        <w:pStyle w:val="205"/>
         <w:rPr>
           <w:rFonts w:cs="Arial"/>
         </w:rPr>
@@ -3126,7 +3126,7 @@
     </w:p>
     <w:p>
       <w:pPr>
-        <w:pStyle w:val="216"/>
+        <w:pStyle w:val="249"/>
         <w:numPr>
           <w:ilvl w:val="0"/>
           <w:numId w:val="1"/>
@@ -3139,14 +3139,14 @@
     </w:p>
     <w:p>
       <w:pPr>
-        <w:pStyle w:val="216"/>
+        <w:pStyle w:val="249"/>
       </w:pPr>
       <w:r/>
       <w:r/>
     </w:p>
     <w:p>
       <w:pPr>
-        <w:pStyle w:val="216"/>
+        <w:pStyle w:val="249"/>
         <w:numPr>
           <w:ilvl w:val="0"/>
           <w:numId w:val="1"/>
@@ -3159,14 +3159,14 @@
     </w:p>
     <w:p>
       <w:pPr>
-        <w:pStyle w:val="216"/>
+        <w:pStyle w:val="249"/>
       </w:pPr>
       <w:r/>
       <w:r/>
     </w:p>
     <w:p>
       <w:pPr>
-        <w:pStyle w:val="216"/>
+        <w:pStyle w:val="249"/>
         <w:numPr>
           <w:ilvl w:val="0"/>
           <w:numId w:val="1"/>
@@ -3179,7 +3179,7 @@
     </w:p>
     <w:p>
       <w:pPr>
-        <w:pStyle w:val="171"/>
+        <w:pStyle w:val="204"/>
         <w:spacing w:after="240"/>
         <w:rPr>
           <w:rFonts w:cs="Arial"/>
@@ -3237,7 +3237,7 @@
     </w:p>
     <w:p>
       <w:pPr>
-        <w:pStyle w:val="171"/>
+        <w:pStyle w:val="204"/>
         <w:numPr>
           <w:ilvl w:val="0"/>
           <w:numId w:val="0"/>
@@ -3256,7 +3256,7 @@
     </w:p>
     <w:p>
       <w:pPr>
-        <w:pStyle w:val="171"/>
+        <w:pStyle w:val="204"/>
         <w:numPr>
           <w:ilvl w:val="0"/>
           <w:numId w:val="0"/>
@@ -3268,7 +3268,7 @@
     </w:p>
     <w:p>
       <w:pPr>
-        <w:pStyle w:val="171"/>
+        <w:pStyle w:val="204"/>
       </w:pPr>
       <w:r>
         <w:t xml:space="preserve">References</w:t>
@@ -3304,7 +3304,7 @@
       <w:hyperlink r:id="rId28" w:history="1">
         <w:r>
           <w:rPr>
-            <w:rStyle w:val="214"/>
+            <w:rStyle w:val="247"/>
           </w:rPr>
           <w:t xml:space="preserve">http://docs.google.com/document/d/10o1mTCwkABsLHihCqECq0BZd9FgMFvmdhi--bnepvdg/edit?usp=sharing</w:t>
         </w:r>
@@ -3345,55 +3345,55 @@
       <w:hyperlink r:id="rId29" w:history="1">
         <w:r>
           <w:rPr>
-            <w:rStyle w:val="214"/>
+            <w:rStyle w:val="247"/>
           </w:rPr>
           <w:t xml:space="preserve">http://www.isixsigm</w:t>
         </w:r>
         <w:r>
           <w:rPr>
-            <w:rStyle w:val="214"/>
+            <w:rStyle w:val="247"/>
           </w:rPr>
           <w:t xml:space="preserve">a</w:t>
         </w:r>
         <w:r>
           <w:rPr>
-            <w:rStyle w:val="214"/>
+            <w:rStyle w:val="247"/>
           </w:rPr>
           <w:t xml:space="preserve">.com/</w:t>
         </w:r>
         <w:r>
           <w:rPr>
-            <w:rStyle w:val="214"/>
+            <w:rStyle w:val="247"/>
           </w:rPr>
           <w:t xml:space="preserve">i</w:t>
         </w:r>
         <w:r>
           <w:rPr>
-            <w:rStyle w:val="214"/>
+            <w:rStyle w:val="247"/>
           </w:rPr>
           <w:t xml:space="preserve">mplementation/project-selection-tracking/business-requirements-document-high-le</w:t>
         </w:r>
         <w:r>
           <w:rPr>
-            <w:rStyle w:val="214"/>
+            <w:rStyle w:val="247"/>
           </w:rPr>
           <w:t xml:space="preserve">v</w:t>
         </w:r>
         <w:r>
           <w:rPr>
-            <w:rStyle w:val="214"/>
+            <w:rStyle w:val="247"/>
           </w:rPr>
           <w:t xml:space="preserve">el</w:t>
         </w:r>
         <w:r>
           <w:rPr>
-            <w:rStyle w:val="214"/>
+            <w:rStyle w:val="247"/>
           </w:rPr>
           <w:t xml:space="preserve">-</w:t>
         </w:r>
         <w:r>
           <w:rPr>
-            <w:rStyle w:val="214"/>
+            <w:rStyle w:val="247"/>
           </w:rPr>
           <w:t xml:space="preserve">review/</w:t>
         </w:r>
@@ -3489,7 +3489,7 @@
     </w:p>
     <w:tbl>
       <w:tblPr>
-        <w:tblStyle w:val="194"/>
+        <w:tblStyle w:val="227"/>
         <w:tblW w:w="0" w:type="auto"/>
         <w:tblLook w:val="04A0" w:firstRow="1" w:lastRow="0" w:firstColumn="1" w:lastColumn="0" w:noHBand="0" w:noVBand="1"/>
       </w:tblPr>
@@ -3727,7 +3727,7 @@
     </w:p>
     <w:p>
       <w:pPr>
-        <w:pStyle w:val="170"/>
+        <w:pStyle w:val="203"/>
         <w:rPr>
           <w:rFonts w:cs="Arial"/>
         </w:rPr>
@@ -3751,7 +3751,7 @@
     </w:p>
     <w:p>
       <w:pPr>
-        <w:pStyle w:val="171"/>
+        <w:pStyle w:val="204"/>
         <w:spacing w:after="240"/>
         <w:rPr>
           <w:rFonts w:cs="Arial"/>
@@ -3802,7 +3802,7 @@
     </w:p>
     <w:p>
       <w:pPr>
-        <w:pStyle w:val="171"/>
+        <w:pStyle w:val="204"/>
         <w:spacing w:after="240"/>
         <w:rPr>
           <w:rFonts w:cs="Arial"/>
@@ -3848,7 +3848,7 @@
     </w:p>
     <w:tbl>
       <w:tblPr>
-        <w:tblStyle w:val="194"/>
+        <w:tblStyle w:val="227"/>
         <w:tblW w:w="0" w:type="auto"/>
         <w:tblLook w:val="04A0" w:firstRow="1" w:lastRow="0" w:firstColumn="1" w:lastColumn="0" w:noHBand="0" w:noVBand="1"/>
       </w:tblPr>
@@ -4165,7 +4165,7 @@
     </w:tbl>
     <w:p>
       <w:pPr>
-        <w:pStyle w:val="215"/>
+        <w:pStyle w:val="248"/>
         <w:rPr>
           <w:rFonts w:cs="Arial"/>
         </w:rPr>
@@ -4216,7 +4216,7 @@
     </w:p>
     <w:p>
       <w:pPr>
-        <w:pStyle w:val="171"/>
+        <w:pStyle w:val="204"/>
         <w:spacing w:after="240"/>
         <w:rPr>
           <w:rFonts w:cs="Arial"/>
@@ -4262,7 +4262,7 @@
     </w:p>
     <w:tbl>
       <w:tblPr>
-        <w:tblStyle w:val="194"/>
+        <w:tblStyle w:val="227"/>
         <w:tblW w:w="0" w:type="auto"/>
         <w:tblLook w:val="04A0" w:firstRow="1" w:lastRow="0" w:firstColumn="1" w:lastColumn="0" w:noHBand="0" w:noVBand="1"/>
       </w:tblPr>
@@ -4683,7 +4683,7 @@
     </w:tbl>
     <w:p>
       <w:pPr>
-        <w:pStyle w:val="215"/>
+        <w:pStyle w:val="248"/>
         <w:rPr>
           <w:rFonts w:cs="Arial"/>
         </w:rPr>
@@ -4750,7 +4750,7 @@
     </w:p>
     <w:p>
       <w:pPr>
-        <w:pStyle w:val="170"/>
+        <w:pStyle w:val="203"/>
         <w:spacing w:after="240"/>
         <w:rPr>
           <w:rFonts w:cs="Arial"/>
@@ -4808,7 +4808,7 @@
     </w:p>
     <w:p>
       <w:pPr>
-        <w:pStyle w:val="171"/>
+        <w:pStyle w:val="204"/>
         <w:spacing w:after="240"/>
         <w:rPr>
           <w:rFonts w:cs="Arial"/>
@@ -4866,7 +4866,7 @@
     </w:p>
     <w:tbl>
       <w:tblPr>
-        <w:tblStyle w:val="194"/>
+        <w:tblStyle w:val="227"/>
         <w:tblW w:w="0" w:type="auto"/>
         <w:tblLook w:val="04A0" w:firstRow="1" w:lastRow="0" w:firstColumn="1" w:lastColumn="0" w:noHBand="0" w:noVBand="1"/>
       </w:tblPr>
@@ -5217,7 +5217,7 @@
     </w:tbl>
     <w:p>
       <w:pPr>
-        <w:pStyle w:val="215"/>
+        <w:pStyle w:val="248"/>
         <w:rPr>
           <w:rFonts w:cs="Arial"/>
         </w:rPr>
@@ -5270,7 +5270,7 @@
     </w:p>
     <w:p>
       <w:pPr>
-        <w:pStyle w:val="171"/>
+        <w:pStyle w:val="204"/>
         <w:spacing w:after="240"/>
         <w:rPr>
           <w:rFonts w:cs="Arial"/>
@@ -5314,7 +5314,7 @@
     </w:p>
     <w:tbl>
       <w:tblPr>
-        <w:tblStyle w:val="194"/>
+        <w:tblStyle w:val="227"/>
         <w:tblW w:w="0" w:type="auto"/>
         <w:tblLook w:val="04A0" w:firstRow="1" w:lastRow="0" w:firstColumn="1" w:lastColumn="0" w:noHBand="0" w:noVBand="1"/>
       </w:tblPr>
@@ -5434,7 +5434,7 @@
               <w:rPr>
                 <w:rFonts w:cs="Arial" w:eastAsia="Times New Roman"/>
               </w:rPr>
-              <w:t xml:space="preserve">[Name the user ]</w:t>
+              <w:t xml:space="preserve">John Doe</w:t>
             </w:r>
             <w:r/>
           </w:p>
@@ -5733,7 +5733,7 @@
     </w:tbl>
     <w:p>
       <w:pPr>
-        <w:pStyle w:val="215"/>
+        <w:pStyle w:val="248"/>
         <w:rPr>
           <w:rFonts w:cs="Arial"/>
         </w:rPr>
@@ -5798,7 +5798,7 @@
     </w:p>
     <w:p>
       <w:pPr>
-        <w:pStyle w:val="170"/>
+        <w:pStyle w:val="203"/>
         <w:spacing w:after="240"/>
         <w:rPr>
           <w:rFonts w:cs="Arial"/>
@@ -5832,7 +5832,7 @@
     </w:p>
     <w:tbl>
       <w:tblPr>
-        <w:tblStyle w:val="194"/>
+        <w:tblStyle w:val="227"/>
         <w:tblW w:w="0" w:type="auto"/>
         <w:tblLook w:val="04A0" w:firstRow="1" w:lastRow="0" w:firstColumn="1" w:lastColumn="0" w:noHBand="0" w:noVBand="1"/>
       </w:tblPr>
@@ -5854,16 +5854,27 @@
           </w:tcPr>
           <w:p>
             <w:pPr>
-              <w:rPr>
-                <w:rFonts w:cs="Arial"/>
-              </w:rPr>
-            </w:pPr>
-            <w:r>
-              <w:rPr>
-                <w:rFonts w:cs="Arial"/>
+              <w:jc w:val="center"/>
+              <w:spacing w:lineRule="auto" w:line="240" w:after="0"/>
+              <w:rPr>
+                <w:rFonts w:ascii="Arial" w:hAnsi="Arial" w:cs="Arial"/>
+              </w:rPr>
+            </w:pPr>
+            <w:r>
+              <w:rPr>
+                <w:rFonts w:ascii="Arial" w:hAnsi="Arial" w:cs="Arial"/>
+                <w:b/>
+                <w:sz w:val="22"/>
               </w:rPr>
               <w:t xml:space="preserve">ID</w:t>
             </w:r>
+            <w:r>
+              <w:rPr>
+                <w:rFonts w:ascii="Arial" w:hAnsi="Arial" w:cs="Arial"/>
+                <w:b/>
+                <w:sz w:val="22"/>
+              </w:rPr>
+            </w:r>
             <w:r/>
           </w:p>
         </w:tc>
@@ -5875,16 +5886,27 @@
           </w:tcPr>
           <w:p>
             <w:pPr>
-              <w:rPr>
-                <w:rFonts w:cs="Arial"/>
-              </w:rPr>
-            </w:pPr>
-            <w:r>
-              <w:rPr>
-                <w:rFonts w:cs="Arial"/>
+              <w:jc w:val="center"/>
+              <w:spacing w:lineRule="auto" w:line="240" w:after="0"/>
+              <w:rPr>
+                <w:rFonts w:ascii="Arial" w:hAnsi="Arial" w:cs="Arial"/>
+              </w:rPr>
+            </w:pPr>
+            <w:r>
+              <w:rPr>
+                <w:rFonts w:ascii="Arial" w:hAnsi="Arial" w:cs="Arial"/>
+                <w:b/>
+                <w:sz w:val="22"/>
               </w:rPr>
               <w:t xml:space="preserve">Requirement</w:t>
             </w:r>
+            <w:r>
+              <w:rPr>
+                <w:rFonts w:ascii="Arial" w:hAnsi="Arial" w:cs="Arial"/>
+                <w:b/>
+                <w:sz w:val="22"/>
+              </w:rPr>
+            </w:r>
             <w:r/>
           </w:p>
         </w:tc>
@@ -5896,15 +5918,26 @@
           </w:tcPr>
           <w:p>
             <w:pPr>
-              <w:rPr>
-                <w:rFonts w:cs="Arial"/>
-              </w:rPr>
-            </w:pPr>
-            <w:r>
-              <w:rPr>
-                <w:rFonts w:cs="Arial"/>
+              <w:jc w:val="center"/>
+              <w:spacing w:lineRule="auto" w:line="240" w:after="0"/>
+              <w:rPr>
+                <w:rFonts w:ascii="Arial" w:hAnsi="Arial" w:cs="Arial"/>
+              </w:rPr>
+            </w:pPr>
+            <w:r>
+              <w:rPr>
+                <w:rFonts w:ascii="Arial" w:hAnsi="Arial" w:cs="Arial"/>
+                <w:b/>
+                <w:sz w:val="22"/>
               </w:rPr>
               <w:t xml:space="preserve">Stakeholder</w:t>
+            </w:r>
+            <w:r>
+              <w:rPr>
+                <w:rFonts w:ascii="Arial" w:hAnsi="Arial" w:cs="Arial"/>
+                <w:b/>
+                <w:sz w:val="22"/>
+              </w:rPr>
             </w:r>
             <w:r/>
           </w:p>
@@ -5922,13 +5955,23 @@
           </w:tcPr>
           <w:p>
             <w:pPr>
-              <w:rPr>
-                <w:rFonts w:cs="Arial"/>
-              </w:rPr>
-            </w:pPr>
-            <w:r>
-              <w:rPr>
-                <w:rFonts w:cs="Arial"/>
+              <w:spacing w:lineRule="auto" w:line="240" w:after="0"/>
+              <w:rPr>
+                <w:rFonts w:ascii="Arial" w:hAnsi="Arial" w:cs="Arial" w:eastAsia="Calibri"/>
+                <w:lang w:val="en-US" w:eastAsia="zh-CN"/>
+              </w:rPr>
+            </w:pPr>
+            <w:r>
+              <w:rPr>
+                <w:rFonts w:ascii="Arial" w:hAnsi="Arial" w:cs="Arial"/>
+                <w:lang w:val="en-US" w:eastAsia="zh-CN"/>
+              </w:rPr>
+              <w:t xml:space="preserve">1.TL</w:t>
+            </w:r>
+            <w:r>
+              <w:rPr>
+                <w:rFonts w:ascii="Arial" w:hAnsi="Arial" w:cs="Arial" w:eastAsia="Calibri"/>
+                <w:lang w:val="en-US" w:eastAsia="zh-CN"/>
               </w:rPr>
             </w:r>
             <w:r/>
@@ -5942,13 +5985,23 @@
           </w:tcPr>
           <w:p>
             <w:pPr>
-              <w:rPr>
-                <w:rFonts w:cs="Arial"/>
-              </w:rPr>
-            </w:pPr>
-            <w:r>
-              <w:rPr>
-                <w:rFonts w:cs="Arial"/>
+              <w:spacing w:lineRule="auto" w:line="240" w:after="0"/>
+              <w:rPr>
+                <w:rFonts w:ascii="Arial" w:hAnsi="Arial" w:cs="Arial" w:eastAsia="Calibri"/>
+                <w:lang w:val="en-US" w:eastAsia="zh-CN"/>
+              </w:rPr>
+            </w:pPr>
+            <w:r>
+              <w:rPr>
+                <w:rFonts w:ascii="Arial" w:hAnsi="Arial" w:cs="Arial"/>
+                <w:lang w:val="en-US" w:eastAsia="zh-CN"/>
+              </w:rPr>
+              <w:t xml:space="preserve">Need to keep team members informed goals and process of projects</w:t>
+            </w:r>
+            <w:r>
+              <w:rPr>
+                <w:rFonts w:ascii="Arial" w:hAnsi="Arial" w:cs="Arial" w:eastAsia="Calibri"/>
+                <w:lang w:val="en-US" w:eastAsia="zh-CN"/>
               </w:rPr>
             </w:r>
             <w:r/>
@@ -5962,13 +6015,26 @@
           </w:tcPr>
           <w:p>
             <w:pPr>
-              <w:rPr>
-                <w:rFonts w:cs="Arial"/>
-              </w:rPr>
-            </w:pPr>
-            <w:r>
-              <w:rPr>
-                <w:rFonts w:cs="Arial"/>
+              <w:spacing w:lineRule="auto" w:line="240" w:after="0"/>
+              <w:tabs>
+                <w:tab w:val="center" w:pos="1456" w:leader="none"/>
+              </w:tabs>
+              <w:rPr>
+                <w:rFonts w:ascii="Arial" w:hAnsi="Arial" w:cs="Arial" w:eastAsia="Calibri"/>
+                <w:lang w:val="en-US" w:eastAsia="zh-CN"/>
+              </w:rPr>
+            </w:pPr>
+            <w:r>
+              <w:rPr>
+                <w:rFonts w:ascii="Arial" w:hAnsi="Arial" w:cs="Arial"/>
+                <w:lang w:val="en-US" w:eastAsia="zh-CN"/>
+              </w:rPr>
+              <w:t xml:space="preserve">Team Leader</w:t>
+            </w:r>
+            <w:r>
+              <w:rPr>
+                <w:rFonts w:ascii="Arial" w:hAnsi="Arial" w:cs="Arial" w:eastAsia="Calibri"/>
+                <w:lang w:val="en-US" w:eastAsia="zh-CN"/>
               </w:rPr>
             </w:r>
             <w:r/>
@@ -5987,13 +6053,23 @@
           </w:tcPr>
           <w:p>
             <w:pPr>
-              <w:rPr>
-                <w:rFonts w:cs="Arial"/>
-              </w:rPr>
-            </w:pPr>
-            <w:r>
-              <w:rPr>
-                <w:rFonts w:cs="Arial"/>
+              <w:spacing w:lineRule="auto" w:line="240" w:after="0"/>
+              <w:rPr>
+                <w:rFonts w:ascii="Arial" w:hAnsi="Arial" w:cs="Arial" w:eastAsia="Calibri"/>
+                <w:lang w:val="en-US" w:eastAsia="zh-CN"/>
+              </w:rPr>
+            </w:pPr>
+            <w:r>
+              <w:rPr>
+                <w:rFonts w:ascii="Arial" w:hAnsi="Arial" w:cs="Arial"/>
+                <w:lang w:val="en-US" w:eastAsia="zh-CN"/>
+              </w:rPr>
+              <w:t xml:space="preserve">2.TM</w:t>
+            </w:r>
+            <w:r>
+              <w:rPr>
+                <w:rFonts w:ascii="Arial" w:hAnsi="Arial" w:cs="Arial" w:eastAsia="Calibri"/>
+                <w:lang w:val="en-US" w:eastAsia="zh-CN"/>
               </w:rPr>
             </w:r>
             <w:r/>
@@ -6007,13 +6083,23 @@
           </w:tcPr>
           <w:p>
             <w:pPr>
-              <w:rPr>
-                <w:rFonts w:cs="Arial"/>
-              </w:rPr>
-            </w:pPr>
-            <w:r>
-              <w:rPr>
-                <w:rFonts w:cs="Arial"/>
+              <w:spacing w:lineRule="auto" w:line="240" w:after="0"/>
+              <w:rPr>
+                <w:rFonts w:ascii="Arial" w:hAnsi="Arial" w:cs="Arial" w:eastAsia="Calibri"/>
+                <w:lang w:val="en-US" w:eastAsia="zh-CN"/>
+              </w:rPr>
+            </w:pPr>
+            <w:r>
+              <w:rPr>
+                <w:rFonts w:ascii="Arial" w:hAnsi="Arial" w:cs="Arial"/>
+                <w:lang w:val="en-US" w:eastAsia="zh-CN"/>
+              </w:rPr>
+              <w:t xml:space="preserve">Need to make projects and test projects</w:t>
+            </w:r>
+            <w:r>
+              <w:rPr>
+                <w:rFonts w:ascii="Arial" w:hAnsi="Arial" w:cs="Arial" w:eastAsia="Calibri"/>
+                <w:lang w:val="en-US" w:eastAsia="zh-CN"/>
               </w:rPr>
             </w:r>
             <w:r/>
@@ -6027,13 +6113,23 @@
           </w:tcPr>
           <w:p>
             <w:pPr>
-              <w:rPr>
-                <w:rFonts w:cs="Arial"/>
-              </w:rPr>
-            </w:pPr>
-            <w:r>
-              <w:rPr>
-                <w:rFonts w:cs="Arial"/>
+              <w:spacing w:lineRule="auto" w:line="240" w:after="0"/>
+              <w:rPr>
+                <w:rFonts w:ascii="Arial" w:hAnsi="Arial" w:cs="Arial" w:eastAsia="Calibri"/>
+                <w:lang w:val="en-US" w:eastAsia="zh-CN"/>
+              </w:rPr>
+            </w:pPr>
+            <w:r>
+              <w:rPr>
+                <w:rFonts w:ascii="Arial" w:hAnsi="Arial" w:cs="Arial"/>
+                <w:lang w:val="en-US" w:eastAsia="zh-CN"/>
+              </w:rPr>
+              <w:t xml:space="preserve">Team members</w:t>
+            </w:r>
+            <w:r>
+              <w:rPr>
+                <w:rFonts w:ascii="Arial" w:hAnsi="Arial" w:cs="Arial" w:eastAsia="Calibri"/>
+                <w:lang w:val="en-US" w:eastAsia="zh-CN"/>
               </w:rPr>
             </w:r>
             <w:r/>
@@ -6052,13 +6148,23 @@
           </w:tcPr>
           <w:p>
             <w:pPr>
-              <w:rPr>
-                <w:rFonts w:cs="Arial"/>
-              </w:rPr>
-            </w:pPr>
-            <w:r>
-              <w:rPr>
-                <w:rFonts w:cs="Arial"/>
+              <w:spacing w:lineRule="auto" w:line="240" w:after="0"/>
+              <w:rPr>
+                <w:rFonts w:ascii="Arial" w:hAnsi="Arial" w:cs="Arial" w:eastAsia="Calibri"/>
+                <w:lang w:val="en-US" w:eastAsia="zh-CN"/>
+              </w:rPr>
+            </w:pPr>
+            <w:r>
+              <w:rPr>
+                <w:rFonts w:ascii="Arial" w:hAnsi="Arial" w:cs="Arial"/>
+                <w:lang w:val="en-US" w:eastAsia="zh-CN"/>
+              </w:rPr>
+              <w:t xml:space="preserve">3.U</w:t>
+            </w:r>
+            <w:r>
+              <w:rPr>
+                <w:rFonts w:ascii="Arial" w:hAnsi="Arial" w:cs="Arial" w:eastAsia="Calibri"/>
+                <w:lang w:val="en-US" w:eastAsia="zh-CN"/>
               </w:rPr>
             </w:r>
             <w:r/>
@@ -6072,13 +6178,23 @@
           </w:tcPr>
           <w:p>
             <w:pPr>
-              <w:rPr>
-                <w:rFonts w:cs="Arial"/>
-              </w:rPr>
-            </w:pPr>
-            <w:r>
-              <w:rPr>
-                <w:rFonts w:cs="Arial"/>
+              <w:spacing w:lineRule="auto" w:line="240" w:after="0"/>
+              <w:rPr>
+                <w:rFonts w:ascii="Arial" w:hAnsi="Arial" w:cs="Arial" w:eastAsia="Calibri"/>
+                <w:lang w:val="en-US" w:eastAsia="zh-CN"/>
+              </w:rPr>
+            </w:pPr>
+            <w:r>
+              <w:rPr>
+                <w:rFonts w:ascii="Arial" w:hAnsi="Arial" w:cs="Arial"/>
+                <w:lang w:val="en-US" w:eastAsia="zh-CN"/>
+              </w:rPr>
+              <w:t xml:space="preserve">Use projects and need to benefit from the project.</w:t>
+            </w:r>
+            <w:r>
+              <w:rPr>
+                <w:rFonts w:ascii="Arial" w:hAnsi="Arial" w:cs="Arial" w:eastAsia="Calibri"/>
+                <w:lang w:val="en-US" w:eastAsia="zh-CN"/>
               </w:rPr>
             </w:r>
             <w:r/>
@@ -6093,13 +6209,23 @@
           <w:p>
             <w:pPr>
               <w:keepNext/>
-              <w:rPr>
-                <w:rFonts w:cs="Arial"/>
-              </w:rPr>
-            </w:pPr>
-            <w:r>
-              <w:rPr>
-                <w:rFonts w:cs="Arial"/>
+              <w:spacing w:lineRule="auto" w:line="240" w:after="0"/>
+              <w:rPr>
+                <w:rFonts w:ascii="Arial" w:hAnsi="Arial" w:cs="Arial" w:eastAsia="Calibri"/>
+                <w:lang w:val="en-US" w:eastAsia="zh-CN"/>
+              </w:rPr>
+            </w:pPr>
+            <w:r>
+              <w:rPr>
+                <w:rFonts w:ascii="Arial" w:hAnsi="Arial" w:cs="Arial"/>
+                <w:lang w:val="en-US" w:eastAsia="zh-CN"/>
+              </w:rPr>
+              <w:t xml:space="preserve">User</w:t>
+            </w:r>
+            <w:r>
+              <w:rPr>
+                <w:rFonts w:ascii="Arial" w:hAnsi="Arial" w:cs="Arial" w:eastAsia="Calibri"/>
+                <w:lang w:val="en-US" w:eastAsia="zh-CN"/>
               </w:rPr>
             </w:r>
             <w:r/>
@@ -6109,7 +6235,7 @@
     </w:tbl>
     <w:p>
       <w:pPr>
-        <w:pStyle w:val="215"/>
+        <w:pStyle w:val="248"/>
         <w:rPr>
           <w:rFonts w:cs="Arial"/>
         </w:rPr>
@@ -6162,7 +6288,7 @@
     </w:p>
     <w:p>
       <w:pPr>
-        <w:pStyle w:val="170"/>
+        <w:pStyle w:val="203"/>
         <w:spacing w:after="240"/>
         <w:rPr>
           <w:rFonts w:cs="Arial"/>
@@ -6213,7 +6339,7 @@
     </w:p>
     <w:tbl>
       <w:tblPr>
-        <w:tblStyle w:val="194"/>
+        <w:tblStyle w:val="227"/>
         <w:tblW w:w="0" w:type="auto"/>
         <w:tblLook w:val="04A0" w:firstRow="1" w:lastRow="0" w:firstColumn="1" w:lastColumn="0" w:noHBand="0" w:noVBand="1"/>
       </w:tblPr>
@@ -6235,16 +6361,27 @@
           </w:tcPr>
           <w:p>
             <w:pPr>
-              <w:rPr>
-                <w:rFonts w:cs="Arial"/>
-              </w:rPr>
-            </w:pPr>
-            <w:r>
-              <w:rPr>
-                <w:rFonts w:cs="Arial"/>
+              <w:jc w:val="center"/>
+              <w:spacing w:lineRule="auto" w:line="240" w:after="0"/>
+              <w:rPr>
+                <w:rFonts w:ascii="Arial" w:hAnsi="Arial" w:cs="Arial"/>
+              </w:rPr>
+            </w:pPr>
+            <w:r>
+              <w:rPr>
+                <w:rFonts w:ascii="Arial" w:hAnsi="Arial" w:cs="Arial"/>
+                <w:b/>
+                <w:sz w:val="22"/>
               </w:rPr>
               <w:t xml:space="preserve">ID</w:t>
             </w:r>
+            <w:r>
+              <w:rPr>
+                <w:rFonts w:ascii="Arial" w:hAnsi="Arial" w:cs="Arial"/>
+                <w:b/>
+                <w:sz w:val="22"/>
+              </w:rPr>
+            </w:r>
             <w:r/>
           </w:p>
         </w:tc>
@@ -6256,16 +6393,27 @@
           </w:tcPr>
           <w:p>
             <w:pPr>
-              <w:rPr>
-                <w:rFonts w:cs="Arial"/>
-              </w:rPr>
-            </w:pPr>
-            <w:r>
-              <w:rPr>
-                <w:rFonts w:cs="Arial"/>
+              <w:jc w:val="center"/>
+              <w:spacing w:lineRule="auto" w:line="240" w:after="0"/>
+              <w:rPr>
+                <w:rFonts w:ascii="Arial" w:hAnsi="Arial" w:cs="Arial"/>
+              </w:rPr>
+            </w:pPr>
+            <w:r>
+              <w:rPr>
+                <w:rFonts w:ascii="Arial" w:hAnsi="Arial" w:cs="Arial"/>
+                <w:b/>
+                <w:sz w:val="22"/>
               </w:rPr>
               <w:t xml:space="preserve">Feature</w:t>
             </w:r>
+            <w:r>
+              <w:rPr>
+                <w:rFonts w:ascii="Arial" w:hAnsi="Arial" w:cs="Arial"/>
+                <w:b/>
+                <w:sz w:val="22"/>
+              </w:rPr>
+            </w:r>
             <w:r/>
           </w:p>
         </w:tc>
@@ -6277,15 +6425,26 @@
           </w:tcPr>
           <w:p>
             <w:pPr>
-              <w:rPr>
-                <w:rFonts w:cs="Arial"/>
-              </w:rPr>
-            </w:pPr>
-            <w:r>
-              <w:rPr>
-                <w:rFonts w:cs="Arial"/>
+              <w:jc w:val="center"/>
+              <w:spacing w:lineRule="auto" w:line="240" w:after="0"/>
+              <w:rPr>
+                <w:rFonts w:ascii="Arial" w:hAnsi="Arial" w:cs="Arial"/>
+              </w:rPr>
+            </w:pPr>
+            <w:r>
+              <w:rPr>
+                <w:rFonts w:ascii="Arial" w:hAnsi="Arial" w:cs="Arial"/>
+                <w:b/>
+                <w:sz w:val="22"/>
               </w:rPr>
               <w:t xml:space="preserve">Stakeholder Requirement ID</w:t>
+            </w:r>
+            <w:r>
+              <w:rPr>
+                <w:rFonts w:ascii="Arial" w:hAnsi="Arial" w:cs="Arial"/>
+                <w:b/>
+                <w:sz w:val="22"/>
+              </w:rPr>
             </w:r>
             <w:r/>
           </w:p>
@@ -6303,13 +6462,40 @@
           </w:tcPr>
           <w:p>
             <w:pPr>
-              <w:rPr>
-                <w:rFonts w:cs="Arial"/>
-              </w:rPr>
-            </w:pPr>
-            <w:r>
-              <w:rPr>
-                <w:rFonts w:cs="Arial"/>
+              <w:spacing w:lineRule="auto" w:line="240" w:after="0"/>
+              <w:rPr>
+                <w:rFonts w:ascii="Arial" w:hAnsi="Arial" w:cs="Arial"/>
+              </w:rPr>
+            </w:pPr>
+            <w:r>
+              <w:rPr>
+                <w:rFonts w:ascii="Arial" w:hAnsi="Arial" w:cs="Arial"/>
+              </w:rPr>
+              <w:t xml:space="preserve">1.Exchange messages</w:t>
+            </w:r>
+            <w:r>
+              <w:rPr>
+                <w:rFonts w:ascii="Arial" w:hAnsi="Arial" w:cs="Arial"/>
+              </w:rPr>
+            </w:r>
+            <w:r/>
+          </w:p>
+          <w:p>
+            <w:pPr>
+              <w:pStyle w:val="249"/>
+              <w:spacing w:lineRule="auto" w:line="240" w:after="0"/>
+              <w:rPr>
+                <w:rFonts w:ascii="Arial" w:hAnsi="Arial" w:cs="Arial"/>
+              </w:rPr>
+            </w:pPr>
+            <w:r>
+              <w:rPr>
+                <w:rFonts w:ascii="Arial" w:hAnsi="Arial" w:cs="Arial"/>
+              </w:rPr>
+            </w:r>
+            <w:r>
+              <w:rPr>
+                <w:rFonts w:ascii="Arial" w:hAnsi="Arial" w:cs="Arial"/>
               </w:rPr>
             </w:r>
             <w:r/>
@@ -6323,13 +6509,23 @@
           </w:tcPr>
           <w:p>
             <w:pPr>
-              <w:rPr>
-                <w:rFonts w:cs="Arial"/>
-              </w:rPr>
-            </w:pPr>
-            <w:r>
-              <w:rPr>
-                <w:rFonts w:cs="Arial"/>
+              <w:spacing w:lineRule="auto" w:line="240" w:after="0"/>
+              <w:rPr>
+                <w:rFonts w:ascii="Arial" w:hAnsi="Arial" w:cs="Arial" w:eastAsia="Calibri"/>
+                <w:lang w:val="en-US" w:eastAsia="zh-CN"/>
+              </w:rPr>
+            </w:pPr>
+            <w:r>
+              <w:rPr>
+                <w:rFonts w:ascii="Arial" w:hAnsi="Arial" w:cs="Arial"/>
+                <w:lang w:val="en-US" w:eastAsia="zh-CN"/>
+              </w:rPr>
+              <w:t xml:space="preserve"> A platform that allows user to exchange messages with people from a specific country/culture via messages. Because many people have a strong interest in the culture of different countries.So the ability to exchange information allows more users or visitors to better understand the culture of each other's countries.</w:t>
+            </w:r>
+            <w:r>
+              <w:rPr>
+                <w:rFonts w:ascii="Arial" w:hAnsi="Arial" w:cs="Arial" w:eastAsia="Calibri"/>
+                <w:lang w:val="en-US" w:eastAsia="zh-CN"/>
               </w:rPr>
             </w:r>
             <w:r/>
@@ -6343,13 +6539,23 @@
           </w:tcPr>
           <w:p>
             <w:pPr>
-              <w:rPr>
-                <w:rFonts w:cs="Arial"/>
-              </w:rPr>
-            </w:pPr>
-            <w:r>
-              <w:rPr>
-                <w:rFonts w:cs="Arial"/>
+              <w:spacing w:lineRule="auto" w:line="240" w:after="0"/>
+              <w:rPr>
+                <w:rFonts w:ascii="Arial" w:hAnsi="Arial" w:cs="Arial" w:eastAsia="Calibri"/>
+                <w:lang w:val="en-US" w:eastAsia="zh-CN"/>
+              </w:rPr>
+            </w:pPr>
+            <w:r>
+              <w:rPr>
+                <w:rFonts w:ascii="Arial" w:hAnsi="Arial" w:cs="Arial"/>
+                <w:lang w:val="en-US" w:eastAsia="zh-CN"/>
+              </w:rPr>
+              <w:t xml:space="preserve">U (User)</w:t>
+            </w:r>
+            <w:r>
+              <w:rPr>
+                <w:rFonts w:ascii="Arial" w:hAnsi="Arial" w:cs="Arial" w:eastAsia="Calibri"/>
+                <w:lang w:val="en-US" w:eastAsia="zh-CN"/>
               </w:rPr>
             </w:r>
             <w:r/>
@@ -6368,13 +6574,39 @@
           </w:tcPr>
           <w:p>
             <w:pPr>
-              <w:rPr>
-                <w:rFonts w:cs="Arial"/>
-              </w:rPr>
-            </w:pPr>
-            <w:r>
-              <w:rPr>
-                <w:rFonts w:cs="Arial"/>
+              <w:spacing w:lineRule="auto" w:line="240" w:after="0"/>
+              <w:rPr>
+                <w:rFonts w:ascii="Arial" w:hAnsi="Arial" w:cs="Arial"/>
+              </w:rPr>
+            </w:pPr>
+            <w:r>
+              <w:rPr>
+                <w:rFonts w:ascii="Arial" w:hAnsi="Arial" w:cs="Arial"/>
+              </w:rPr>
+              <w:t xml:space="preserve">2.Wiki</w:t>
+            </w:r>
+            <w:r>
+              <w:rPr>
+                <w:rFonts w:ascii="Arial" w:hAnsi="Arial" w:cs="Arial"/>
+              </w:rPr>
+            </w:r>
+            <w:r/>
+          </w:p>
+          <w:p>
+            <w:pPr>
+              <w:spacing w:lineRule="auto" w:line="240" w:after="0"/>
+              <w:rPr>
+                <w:rFonts w:ascii="Arial" w:hAnsi="Arial" w:cs="Arial"/>
+              </w:rPr>
+            </w:pPr>
+            <w:r>
+              <w:rPr>
+                <w:rFonts w:ascii="Arial" w:hAnsi="Arial" w:cs="Arial"/>
+              </w:rPr>
+            </w:r>
+            <w:r>
+              <w:rPr>
+                <w:rFonts w:ascii="Arial" w:hAnsi="Arial" w:cs="Arial"/>
               </w:rPr>
             </w:r>
             <w:r/>
@@ -6388,13 +6620,20 @@
           </w:tcPr>
           <w:p>
             <w:pPr>
-              <w:rPr>
-                <w:rFonts w:cs="Arial"/>
-              </w:rPr>
-            </w:pPr>
-            <w:r>
-              <w:rPr>
-                <w:rFonts w:cs="Arial"/>
+              <w:spacing w:lineRule="auto" w:line="240" w:after="0"/>
+              <w:rPr>
+                <w:rFonts w:ascii="Arial" w:hAnsi="Arial" w:cs="Arial"/>
+              </w:rPr>
+            </w:pPr>
+            <w:r>
+              <w:rPr>
+                <w:rFonts w:ascii="Calibri" w:hAnsi="Calibri" w:cs="Calibri" w:eastAsia="Calibri"/>
+              </w:rPr>
+              <w:t xml:space="preserve">A wiki for users to find country specific information. This wiki  can list all the local cultures. User can learn about the regional culture they like according to their own preferences.</w:t>
+            </w:r>
+            <w:r>
+              <w:rPr>
+                <w:rFonts w:ascii="Arial" w:hAnsi="Arial" w:cs="Arial"/>
               </w:rPr>
             </w:r>
             <w:r/>
@@ -6408,14 +6647,305 @@
           </w:tcPr>
           <w:p>
             <w:pPr>
+              <w:spacing w:lineRule="auto" w:line="240" w:after="0"/>
+              <w:rPr>
+                <w:rFonts w:ascii="Arial" w:hAnsi="Arial" w:cs="Arial" w:eastAsia="Calibri"/>
+                <w:lang w:val="en-US" w:eastAsia="zh-CN"/>
+              </w:rPr>
+            </w:pPr>
+            <w:r>
+              <w:rPr>
+                <w:rFonts w:ascii="Arial" w:hAnsi="Arial" w:cs="Arial"/>
+                <w:lang w:val="en-US" w:eastAsia="zh-CN"/>
+              </w:rPr>
+              <w:t xml:space="preserve">TM(Team members)</w:t>
+            </w:r>
+            <w:r>
+              <w:rPr>
+                <w:rFonts w:ascii="Arial" w:hAnsi="Arial" w:cs="Arial" w:eastAsia="Calibri"/>
+                <w:lang w:val="en-US" w:eastAsia="zh-CN"/>
+              </w:rPr>
+            </w:r>
+            <w:r/>
+          </w:p>
+        </w:tc>
+      </w:tr>
+      <w:tr>
+        <w:trPr/>
+        <w:tc>
+          <w:tcPr>
+            <w:tcW w:w="3192" w:type="dxa"/>
+            <w:vMerge w:val="restart"/>
+            <w:textDirection w:val="lrTb"/>
+            <w:noWrap w:val="false"/>
+          </w:tcPr>
+          <w:p>
+            <w:pPr>
+              <w:spacing w:lineRule="auto" w:line="240" w:after="0"/>
+              <w:rPr>
+                <w:rFonts w:ascii="Arial" w:hAnsi="Arial" w:cs="Arial"/>
+              </w:rPr>
+            </w:pPr>
+            <w:r>
+              <w:rPr>
+                <w:rFonts w:ascii="Arial" w:hAnsi="Arial" w:cs="Arial"/>
+              </w:rPr>
+              <w:t xml:space="preserve">3.Discussion board</w:t>
+            </w:r>
+            <w:r>
+              <w:rPr>
+                <w:rFonts w:ascii="Arial" w:hAnsi="Arial" w:cs="Arial"/>
+              </w:rPr>
+            </w:r>
+            <w:r/>
+          </w:p>
+        </w:tc>
+        <w:tc>
+          <w:tcPr>
+            <w:tcW w:w="3192" w:type="dxa"/>
+            <w:vMerge w:val="restart"/>
+            <w:textDirection w:val="lrTb"/>
+            <w:noWrap w:val="false"/>
+          </w:tcPr>
+          <w:p>
+            <w:pPr>
+              <w:spacing w:lineRule="auto" w:line="240" w:after="0"/>
+              <w:rPr>
+                <w:rFonts w:ascii="Arial" w:hAnsi="Arial" w:cs="Arial"/>
+              </w:rPr>
+            </w:pPr>
+            <w:r>
+              <w:rPr>
+                <w:rFonts w:ascii="Calibri" w:hAnsi="Calibri" w:cs="Calibri" w:eastAsia="Calibri"/>
+              </w:rPr>
+              <w:t xml:space="preserve">A discussion board where users can post questions and get responses from other users. Users can make group to off-line activity.</w:t>
+            </w:r>
+            <w:r>
+              <w:rPr>
+                <w:rFonts w:ascii="Arial" w:hAnsi="Arial" w:cs="Arial"/>
+              </w:rPr>
+            </w:r>
+            <w:r/>
+          </w:p>
+        </w:tc>
+        <w:tc>
+          <w:tcPr>
+            <w:tcW w:w="3192" w:type="dxa"/>
+            <w:vMerge w:val="restart"/>
+            <w:textDirection w:val="lrTb"/>
+            <w:noWrap w:val="false"/>
+          </w:tcPr>
+          <w:p>
+            <w:pPr>
+              <w:spacing w:lineRule="auto" w:line="240" w:after="0"/>
+              <w:rPr>
+                <w:rFonts w:ascii="Arial" w:hAnsi="Arial" w:cs="Arial"/>
+                <w:lang w:val="en-US" w:eastAsia="zh-CN"/>
+              </w:rPr>
+            </w:pPr>
+            <w:r>
+              <w:rPr>
+                <w:rFonts w:ascii="Arial" w:hAnsi="Arial" w:cs="Arial"/>
+                <w:lang w:val="en-US" w:eastAsia="zh-CN"/>
+              </w:rPr>
+              <w:t xml:space="preserve">U(user)</w:t>
+            </w:r>
+            <w:r>
+              <w:rPr>
+                <w:rFonts w:ascii="Arial" w:hAnsi="Arial" w:cs="Arial"/>
+                <w:lang w:val="en-US" w:eastAsia="zh-CN"/>
+              </w:rPr>
+            </w:r>
+            <w:r/>
+          </w:p>
+          <w:p>
+            <w:pPr>
+              <w:spacing w:lineRule="auto" w:line="240" w:after="0"/>
+              <w:rPr>
+                <w:rFonts w:ascii="Arial" w:hAnsi="Arial" w:cs="Arial"/>
+                <w:lang w:val="en-US" w:eastAsia="zh-CN"/>
+              </w:rPr>
+            </w:pPr>
+            <w:r>
+              <w:rPr>
+                <w:rFonts w:ascii="Arial" w:hAnsi="Arial" w:cs="Arial"/>
+                <w:lang w:val="en-US" w:eastAsia="zh-CN"/>
+              </w:rPr>
+              <w:t xml:space="preserve">TM(Team members)</w:t>
+            </w:r>
+            <w:r>
+              <w:rPr>
+                <w:rFonts w:ascii="Arial" w:hAnsi="Arial" w:cs="Arial"/>
+                <w:lang w:val="en-US" w:eastAsia="zh-CN"/>
+              </w:rPr>
+            </w:r>
+            <w:r/>
+          </w:p>
+          <w:p>
+            <w:pPr>
+              <w:spacing w:lineRule="auto" w:line="240" w:after="0"/>
+              <w:rPr>
+                <w:rFonts w:ascii="Arial" w:hAnsi="Arial" w:cs="Arial"/>
+                <w:lang w:val="en-US" w:eastAsia="zh-CN"/>
+              </w:rPr>
+            </w:pPr>
+            <w:r>
+              <w:rPr>
+                <w:rFonts w:ascii="Arial" w:hAnsi="Arial" w:cs="Arial"/>
+                <w:lang w:val="en-US" w:eastAsia="zh-CN"/>
+              </w:rPr>
+            </w:r>
+            <w:r>
+              <w:rPr>
+                <w:rFonts w:ascii="Arial" w:hAnsi="Arial" w:cs="Arial"/>
+                <w:lang w:val="en-US" w:eastAsia="zh-CN"/>
+              </w:rPr>
+            </w:r>
+            <w:r/>
+          </w:p>
+        </w:tc>
+      </w:tr>
+      <w:tr>
+        <w:trPr/>
+        <w:tc>
+          <w:tcPr>
+            <w:tcW w:w="3192" w:type="dxa"/>
+            <w:vMerge w:val="restart"/>
+            <w:textDirection w:val="lrTb"/>
+            <w:noWrap w:val="false"/>
+          </w:tcPr>
+          <w:p>
+            <w:pPr>
+              <w:spacing w:lineRule="auto" w:line="240" w:after="0"/>
+              <w:rPr>
+                <w:rFonts w:ascii="宋体" w:hAnsi="宋体" w:cs="宋体" w:eastAsia="宋体"/>
+              </w:rPr>
+            </w:pPr>
+            <w:r>
+              <w:rPr>
+                <w:rFonts w:ascii="Arial" w:hAnsi="Arial" w:cs="Arial"/>
+              </w:rPr>
+              <w:t xml:space="preserve">4</w:t>
+            </w:r>
+            <w:r>
+              <w:rPr>
+                <w:rFonts w:ascii="Arial" w:hAnsi="Arial" w:cs="Arial"/>
+                <w:lang w:val="en-US" w:eastAsia="zh-CN"/>
+              </w:rPr>
+              <w:t xml:space="preserve">.registration system </w:t>
+            </w:r>
+            <w:r>
+              <w:rPr>
+                <w:rFonts w:ascii="宋体" w:hAnsi="宋体" w:cs="宋体" w:eastAsia="宋体"/>
+                <w:sz w:val="24"/>
+                <w:szCs w:val="24"/>
+              </w:rPr>
+            </w:r>
+            <w:r/>
+          </w:p>
+          <w:p>
+            <w:pPr>
+              <w:spacing w:lineRule="auto" w:line="240" w:after="0"/>
+              <w:rPr>
+                <w:rFonts w:ascii="宋体" w:hAnsi="宋体" w:cs="宋体" w:eastAsia="宋体"/>
+              </w:rPr>
+            </w:pPr>
+            <w:r>
+              <w:rPr>
+                <w:rFonts w:ascii="宋体" w:hAnsi="宋体" w:cs="宋体" w:eastAsia="宋体"/>
+                <w:sz w:val="24"/>
+                <w:szCs w:val="24"/>
+              </w:rPr>
+            </w:r>
+            <w:r>
+              <w:rPr>
+                <w:rFonts w:ascii="宋体" w:hAnsi="宋体" w:cs="宋体" w:eastAsia="宋体"/>
+                <w:sz w:val="24"/>
+                <w:szCs w:val="24"/>
+              </w:rPr>
+            </w:r>
+            <w:r/>
+          </w:p>
+        </w:tc>
+        <w:tc>
+          <w:tcPr>
+            <w:tcW w:w="3192" w:type="dxa"/>
+            <w:vMerge w:val="restart"/>
+            <w:textDirection w:val="lrTb"/>
+            <w:noWrap w:val="false"/>
+          </w:tcPr>
+          <w:p>
+            <w:pPr>
+              <w:spacing w:lineRule="auto" w:line="240" w:after="0"/>
+              <w:rPr>
+                <w:rFonts w:ascii="Arial" w:hAnsi="Arial" w:cs="Arial"/>
+              </w:rPr>
+            </w:pPr>
+            <w:r>
+              <w:rPr>
+                <w:rFonts w:ascii="Arial" w:hAnsi="Arial" w:cs="Arial"/>
+              </w:rPr>
+              <w:t xml:space="preserve">A system that allows people to indicate country of origin. People can book special holiday events according to their registered country.</w:t>
+            </w:r>
+            <w:r>
+              <w:rPr>
+                <w:rFonts w:ascii="Arial" w:hAnsi="Arial" w:cs="Arial"/>
+              </w:rPr>
+            </w:r>
+            <w:r/>
+          </w:p>
+        </w:tc>
+        <w:tc>
+          <w:tcPr>
+            <w:tcW w:w="3192" w:type="dxa"/>
+            <w:vMerge w:val="restart"/>
+            <w:textDirection w:val="lrTb"/>
+            <w:noWrap w:val="false"/>
+          </w:tcPr>
+          <w:p>
+            <w:pPr>
               <w:keepNext/>
-              <w:rPr>
-                <w:rFonts w:cs="Arial"/>
-              </w:rPr>
-            </w:pPr>
-            <w:r>
-              <w:rPr>
-                <w:rFonts w:cs="Arial"/>
+              <w:spacing w:lineRule="auto" w:line="240" w:after="0"/>
+              <w:rPr>
+                <w:rFonts w:ascii="Arial" w:hAnsi="Arial" w:cs="Arial"/>
+                <w:lang w:val="en-US" w:eastAsia="zh-CN"/>
+              </w:rPr>
+            </w:pPr>
+            <w:r>
+              <w:rPr>
+                <w:rFonts w:ascii="Arial" w:hAnsi="Arial" w:cs="Arial"/>
+                <w:lang w:val="en-US" w:eastAsia="zh-CN"/>
+              </w:rPr>
+              <w:t xml:space="preserve">U(user)</w:t>
+            </w:r>
+            <w:r>
+              <w:rPr>
+                <w:rFonts w:ascii="Arial" w:hAnsi="Arial" w:cs="Arial"/>
+                <w:lang w:val="en-US" w:eastAsia="zh-CN"/>
+              </w:rPr>
+            </w:r>
+            <w:r/>
+          </w:p>
+          <w:p>
+            <w:pPr>
+              <w:keepNext/>
+              <w:spacing w:lineRule="auto" w:line="240" w:after="0"/>
+              <w:rPr>
+                <w:rFonts w:ascii="Arial" w:hAnsi="Arial" w:cs="Arial"/>
+                <w:lang w:val="en-US" w:eastAsia="zh-CN"/>
+              </w:rPr>
+            </w:pPr>
+            <w:r>
+              <w:rPr>
+                <w:rFonts w:ascii="Arial" w:hAnsi="Arial" w:cs="Arial"/>
+                <w:lang w:val="en-US" w:eastAsia="zh-CN"/>
+              </w:rPr>
+              <w:t xml:space="preserve">TM(Team members)</w:t>
+            </w:r>
+            <w:r>
+              <w:rPr>
+                <w:rFonts w:ascii="Arial" w:hAnsi="Arial" w:cs="Arial"/>
+                <w:lang w:val="en-US" w:eastAsia="zh-CN"/>
               </w:rPr>
             </w:r>
             <w:r/>
@@ -6425,7 +6955,7 @@
     </w:tbl>
     <w:p>
       <w:pPr>
-        <w:pStyle w:val="215"/>
+        <w:pStyle w:val="248"/>
         <w:rPr>
           <w:rFonts w:cs="Arial"/>
         </w:rPr>
@@ -6478,7 +7008,7 @@
     </w:p>
     <w:p>
       <w:pPr>
-        <w:pStyle w:val="170"/>
+        <w:pStyle w:val="203"/>
         <w:spacing w:after="240"/>
         <w:rPr>
           <w:rFonts w:cs="Arial"/>
@@ -6522,7 +7052,7 @@
     </w:p>
     <w:p>
       <w:pPr>
-        <w:pStyle w:val="170"/>
+        <w:pStyle w:val="203"/>
         <w:spacing w:after="240"/>
         <w:rPr>
           <w:rFonts w:cs="Arial"/>
@@ -6544,26 +7074,400 @@
       <w:pPr>
         <w:rPr>
           <w:rFonts w:ascii="Arial" w:hAnsi="Arial" w:cs="Arial"/>
+          <w:b/>
         </w:rPr>
       </w:pPr>
       <w:r>
         <w:rPr>
           <w:rFonts w:ascii="Arial" w:hAnsi="Arial" w:cs="Arial"/>
-        </w:rPr>
-        <w:t xml:space="preserve">&lt;List </w:t>
-      </w:r>
-      <w:r>
-        <w:rPr>
-          <w:rFonts w:ascii="Arial" w:hAnsi="Arial" w:cs="Arial" w:eastAsia="Times New Roman"/>
-        </w:rPr>
-        <w:t xml:space="preserve">any process constraints, external constraints or other dependencies</w:t>
-      </w:r>
-      <w:r>
-        <w:rPr>
-          <w:rFonts w:ascii="Arial" w:hAnsi="Arial" w:cs="Arial"/>
-        </w:rPr>
-        <w:t xml:space="preserve"> &gt;</w:t>
-      </w:r>
+          <w:b/>
+        </w:rPr>
+      </w:r>
+      <w:r>
+        <w:rPr>
+          <w:rFonts w:ascii="Arial" w:hAnsi="Arial" w:cs="Arial"/>
+          <w:b/>
+          <w:lang w:val="en-US" w:eastAsia="zh-CN"/>
+        </w:rPr>
+        <w:t xml:space="preserve">Process constraints:</w:t>
+      </w:r>
+      <w:r>
+        <w:rPr>
+          <w:rFonts w:ascii="Arial" w:hAnsi="Arial" w:cs="Arial"/>
+          <w:b/>
+          <w:lang w:val="en-US" w:eastAsia="zh-CN"/>
+        </w:rPr>
+      </w:r>
+      <w:r>
+        <w:rPr>
+          <w:b/>
+        </w:rPr>
+      </w:r>
+    </w:p>
+    <w:p>
+      <w:pPr>
+        <w:ind w:firstLine="720"/>
+        <w:rPr>
+          <w:rFonts w:ascii="Arial" w:hAnsi="Arial" w:cs="Arial"/>
+          <w:lang w:val="en-US" w:eastAsia="zh-CN"/>
+        </w:rPr>
+      </w:pPr>
+      <w:r>
+        <w:rPr>
+          <w:rFonts w:ascii="Arial" w:hAnsi="Arial" w:cs="Arial"/>
+          <w:b/>
+          <w:lang w:val="en-US" w:eastAsia="zh-CN"/>
+        </w:rPr>
+        <w:t xml:space="preserve">Design</w:t>
+      </w:r>
+      <w:r>
+        <w:rPr>
+          <w:rFonts w:ascii="Arial" w:hAnsi="Arial" w:cs="Arial"/>
+          <w:lang w:val="en-US" w:eastAsia="zh-CN"/>
+        </w:rPr>
+        <w:t xml:space="preserve">:</w:t>
+      </w:r>
+      <w:r>
+        <w:rPr>
+          <w:rFonts w:ascii="Arial" w:hAnsi="Arial" w:cs="Arial"/>
+          <w:lang w:val="en-US" w:eastAsia="zh-CN"/>
+        </w:rPr>
+      </w:r>
+      <w:r/>
+    </w:p>
+    <w:p>
+      <w:pPr>
+        <w:ind w:left="720" w:firstLine="720"/>
+        <w:rPr>
+          <w:rFonts w:ascii="Arial" w:hAnsi="Arial" w:cs="Arial"/>
+          <w:lang w:val="en-US" w:eastAsia="zh-CN"/>
+        </w:rPr>
+      </w:pPr>
+      <w:r>
+        <w:rPr>
+          <w:rFonts w:ascii="Arial" w:hAnsi="Arial" w:cs="Arial"/>
+          <w:lang w:val="en-US" w:eastAsia="zh-CN"/>
+        </w:rPr>
+        <w:t xml:space="preserve">We need to design a website that meets the user's requirements and stakeholder needs that the beneficiary needs.</w:t>
+      </w:r>
+      <w:r>
+        <w:rPr>
+          <w:rFonts w:ascii="Arial" w:hAnsi="Arial" w:cs="Arial"/>
+          <w:lang w:val="en-US" w:eastAsia="zh-CN"/>
+        </w:rPr>
+      </w:r>
+      <w:r/>
+    </w:p>
+    <w:p>
+      <w:pPr>
+        <w:ind w:firstLine="720"/>
+        <w:rPr>
+          <w:rFonts w:ascii="Arial" w:hAnsi="Arial" w:cs="Arial"/>
+          <w:lang w:val="en-US" w:eastAsia="zh-CN"/>
+        </w:rPr>
+      </w:pPr>
+      <w:r>
+        <w:rPr>
+          <w:rFonts w:ascii="Arial" w:hAnsi="Arial" w:cs="Arial"/>
+          <w:b/>
+          <w:lang w:val="en-US" w:eastAsia="zh-CN"/>
+        </w:rPr>
+        <w:t xml:space="preserve">Time</w:t>
+      </w:r>
+      <w:r>
+        <w:rPr>
+          <w:rFonts w:ascii="Arial" w:hAnsi="Arial" w:cs="Arial"/>
+          <w:lang w:val="en-US" w:eastAsia="zh-CN"/>
+        </w:rPr>
+        <w:t xml:space="preserve">:</w:t>
+      </w:r>
+      <w:r>
+        <w:rPr>
+          <w:rFonts w:ascii="Arial" w:hAnsi="Arial" w:cs="Arial"/>
+          <w:lang w:val="en-US" w:eastAsia="zh-CN"/>
+        </w:rPr>
+      </w:r>
+      <w:r/>
+    </w:p>
+    <w:p>
+      <w:pPr>
+        <w:ind w:left="720" w:firstLine="720"/>
+        <w:rPr>
+          <w:rFonts w:ascii="Arial" w:hAnsi="Arial" w:cs="Arial"/>
+          <w:lang w:val="en-US" w:eastAsia="zh-CN"/>
+        </w:rPr>
+      </w:pPr>
+      <w:r>
+        <w:rPr>
+          <w:rFonts w:ascii="Arial" w:hAnsi="Arial" w:cs="Arial"/>
+          <w:lang w:val="en-US" w:eastAsia="zh-CN"/>
+        </w:rPr>
+        <w:t xml:space="preserve">We need to complete web template design and group discussions on time.</w:t>
+      </w:r>
+      <w:r>
+        <w:rPr>
+          <w:rFonts w:ascii="Arial" w:hAnsi="Arial" w:cs="Arial"/>
+          <w:lang w:val="en-US" w:eastAsia="zh-CN"/>
+        </w:rPr>
+      </w:r>
+      <w:r/>
+    </w:p>
+    <w:p>
+      <w:pPr>
+        <w:ind w:firstLine="720"/>
+        <w:rPr>
+          <w:rFonts w:ascii="Arial" w:hAnsi="Arial" w:cs="Arial"/>
+          <w:lang w:val="en-US" w:eastAsia="zh-CN"/>
+        </w:rPr>
+      </w:pPr>
+      <w:r>
+        <w:rPr>
+          <w:rFonts w:ascii="Arial" w:hAnsi="Arial" w:cs="Arial"/>
+          <w:b/>
+          <w:lang w:val="en-US" w:eastAsia="zh-CN"/>
+        </w:rPr>
+        <w:t xml:space="preserve">Scope</w:t>
+      </w:r>
+      <w:r>
+        <w:rPr>
+          <w:rFonts w:ascii="Arial" w:hAnsi="Arial" w:cs="Arial"/>
+          <w:lang w:val="en-US" w:eastAsia="zh-CN"/>
+        </w:rPr>
+        <w:t xml:space="preserve">:</w:t>
+      </w:r>
+      <w:r>
+        <w:rPr>
+          <w:rFonts w:ascii="Arial" w:hAnsi="Arial" w:cs="Arial"/>
+          <w:lang w:val="en-US" w:eastAsia="zh-CN"/>
+        </w:rPr>
+      </w:r>
+      <w:r/>
+    </w:p>
+    <w:p>
+      <w:pPr>
+        <w:ind w:left="720" w:firstLine="720"/>
+        <w:rPr>
+          <w:rFonts w:ascii="Arial" w:hAnsi="Arial" w:cs="Arial"/>
+          <w:lang w:val="en-US" w:eastAsia="zh-CN"/>
+        </w:rPr>
+      </w:pPr>
+      <w:r>
+        <w:rPr>
+          <w:rFonts w:ascii="Arial" w:hAnsi="Arial" w:cs="Arial"/>
+          <w:lang w:val="en-US" w:eastAsia="zh-CN"/>
+        </w:rPr>
+        <w:t xml:space="preserve">The minimum scope of a project such we need China and Vietnam culture. We do not have able to accept statistics from global culture.</w:t>
+      </w:r>
+      <w:r>
+        <w:rPr>
+          <w:rFonts w:ascii="Arial" w:hAnsi="Arial" w:cs="Arial"/>
+          <w:lang w:val="en-US" w:eastAsia="zh-CN"/>
+        </w:rPr>
+      </w:r>
+      <w:r/>
+    </w:p>
+    <w:p>
+      <w:pPr>
+        <w:ind w:left="720" w:firstLine="720"/>
+        <w:rPr>
+          <w:rFonts w:ascii="Arial" w:hAnsi="Arial" w:cs="Arial"/>
+          <w:lang w:val="en-US" w:eastAsia="zh-CN"/>
+        </w:rPr>
+      </w:pPr>
+      <w:r>
+        <w:rPr>
+          <w:rFonts w:ascii="Arial" w:hAnsi="Arial" w:cs="Arial"/>
+          <w:lang w:val="en-US" w:eastAsia="zh-CN"/>
+        </w:rPr>
+      </w:r>
+      <w:r>
+        <w:rPr>
+          <w:rFonts w:ascii="Arial" w:hAnsi="Arial" w:cs="Arial"/>
+          <w:lang w:val="en-US" w:eastAsia="zh-CN"/>
+        </w:rPr>
+      </w:r>
+      <w:r/>
+    </w:p>
+    <w:p>
+      <w:pPr>
+        <w:rPr>
+          <w:rFonts w:ascii="Arial" w:hAnsi="Arial" w:cs="Arial"/>
+          <w:b/>
+        </w:rPr>
+      </w:pPr>
+      <w:r>
+        <w:rPr>
+          <w:rFonts w:ascii="Arial" w:hAnsi="Arial" w:cs="Arial"/>
+          <w:b/>
+          <w:lang w:val="en-US" w:eastAsia="zh-CN"/>
+        </w:rPr>
+        <w:t xml:space="preserve">External constraints:</w:t>
+      </w:r>
+      <w:r>
+        <w:rPr>
+          <w:rFonts w:ascii="Arial" w:hAnsi="Arial" w:cs="Arial"/>
+          <w:b/>
+          <w:lang w:val="en-US" w:eastAsia="zh-CN"/>
+        </w:rPr>
+      </w:r>
+      <w:r>
+        <w:rPr>
+          <w:b/>
+        </w:rPr>
+      </w:r>
+    </w:p>
+    <w:p>
+      <w:pPr>
+        <w:ind w:firstLine="720"/>
+        <w:rPr>
+          <w:rFonts w:ascii="Arial" w:hAnsi="Arial" w:cs="Arial"/>
+          <w:lang w:val="en-US" w:eastAsia="zh-CN"/>
+        </w:rPr>
+      </w:pPr>
+      <w:r>
+        <w:rPr>
+          <w:rFonts w:ascii="Arial" w:hAnsi="Arial" w:cs="Arial"/>
+          <w:lang w:val="en-US" w:eastAsia="zh-CN"/>
+        </w:rPr>
+        <w:t xml:space="preserve">1.</w:t>
+      </w:r>
+      <w:r>
+        <w:rPr>
+          <w:rFonts w:ascii="Arial" w:hAnsi="Arial" w:cs="Arial"/>
+          <w:lang w:val="en-US" w:eastAsia="zh-CN"/>
+        </w:rPr>
+      </w:r>
+      <w:r/>
+    </w:p>
+    <w:p>
+      <w:pPr>
+        <w:ind w:left="720" w:firstLine="720"/>
+        <w:rPr>
+          <w:rFonts w:ascii="Arial" w:hAnsi="Arial" w:cs="Arial"/>
+          <w:lang w:val="en-US" w:eastAsia="zh-CN"/>
+        </w:rPr>
+      </w:pPr>
+      <w:r>
+        <w:rPr>
+          <w:rFonts w:ascii="Arial" w:hAnsi="Arial" w:cs="Arial"/>
+          <w:lang w:val="en-US" w:eastAsia="zh-CN"/>
+        </w:rPr>
+        <w:t xml:space="preserve">Need to collect important national festivals or religious beliefs.</w:t>
+      </w:r>
+      <w:r>
+        <w:rPr>
+          <w:rFonts w:ascii="Arial" w:hAnsi="Arial" w:cs="Arial"/>
+          <w:lang w:val="en-US" w:eastAsia="zh-CN"/>
+        </w:rPr>
+      </w:r>
+      <w:r/>
+    </w:p>
+    <w:p>
+      <w:pPr>
+        <w:ind w:firstLine="720"/>
+        <w:rPr>
+          <w:rFonts w:ascii="Arial" w:hAnsi="Arial" w:cs="Arial"/>
+          <w:lang w:val="en-US" w:eastAsia="zh-CN"/>
+        </w:rPr>
+      </w:pPr>
+      <w:r>
+        <w:rPr>
+          <w:rFonts w:ascii="Arial" w:hAnsi="Arial" w:cs="Arial"/>
+          <w:lang w:val="en-US" w:eastAsia="zh-CN"/>
+        </w:rPr>
+        <w:t xml:space="preserve">2.</w:t>
+      </w:r>
+      <w:r>
+        <w:rPr>
+          <w:rFonts w:ascii="Arial" w:hAnsi="Arial" w:cs="Arial"/>
+          <w:lang w:val="en-US" w:eastAsia="zh-CN"/>
+        </w:rPr>
+      </w:r>
+      <w:r/>
+    </w:p>
+    <w:p>
+      <w:pPr>
+        <w:ind w:left="720" w:firstLine="720"/>
+        <w:rPr>
+          <w:rFonts w:ascii="Arial" w:hAnsi="Arial" w:cs="Arial"/>
+          <w:lang w:val="en-US" w:eastAsia="zh-CN"/>
+        </w:rPr>
+      </w:pPr>
+      <w:r>
+        <w:rPr>
+          <w:rFonts w:ascii="Arial" w:hAnsi="Arial" w:cs="Arial"/>
+          <w:lang w:val="en-US" w:eastAsia="zh-CN"/>
+        </w:rPr>
+        <w:t xml:space="preserve">Legal constraints. For example, we can't spread bad cultures in some places, such as unhealthy culture.</w:t>
+      </w:r>
+      <w:r>
+        <w:rPr>
+          <w:rFonts w:ascii="Arial" w:hAnsi="Arial" w:cs="Arial"/>
+          <w:lang w:val="en-US" w:eastAsia="zh-CN"/>
+        </w:rPr>
+      </w:r>
+      <w:r/>
+    </w:p>
+    <w:p>
+      <w:pPr>
+        <w:numPr>
+          <w:numId w:val="0"/>
+        </w:numPr>
+        <w:ind w:firstLine="720"/>
+        <w:spacing w:lineRule="auto" w:line="276" w:after="200"/>
+        <w:rPr>
+          <w:rFonts w:ascii="Arial" w:hAnsi="Arial" w:cs="Arial"/>
+          <w:lang w:val="en-US" w:eastAsia="zh-CN"/>
+        </w:rPr>
+      </w:pPr>
+      <w:r>
+        <w:rPr>
+          <w:rFonts w:ascii="Arial" w:hAnsi="Arial" w:cs="Arial"/>
+          <w:lang w:val="en-US" w:eastAsia="zh-CN"/>
+        </w:rPr>
+        <w:t xml:space="preserve">3.</w:t>
+      </w:r>
+      <w:r>
+        <w:rPr>
+          <w:rFonts w:ascii="Arial" w:hAnsi="Arial" w:cs="Arial"/>
+          <w:lang w:val="en-US" w:eastAsia="zh-CN"/>
+        </w:rPr>
+      </w:r>
+      <w:r/>
+    </w:p>
+    <w:p>
+      <w:pPr>
+        <w:numPr>
+          <w:numId w:val="0"/>
+        </w:numPr>
+        <w:ind w:firstLine="720"/>
+        <w:spacing w:lineRule="auto" w:line="276" w:after="200"/>
+        <w:rPr>
+          <w:rFonts w:ascii="Arial" w:hAnsi="Arial" w:cs="Arial"/>
+          <w:lang w:val="en-US" w:eastAsia="zh-CN"/>
+        </w:rPr>
+      </w:pPr>
+      <w:r>
+        <w:rPr>
+          <w:rFonts w:ascii="Arial" w:hAnsi="Arial" w:cs="Arial"/>
+          <w:lang w:val="en-US" w:eastAsia="zh-CN"/>
+        </w:rPr>
+        <w:t xml:space="preserve">It takes time for each member of the group to match up.</w:t>
+      </w:r>
+      <w:r>
+        <w:rPr>
+          <w:rFonts w:ascii="Arial" w:hAnsi="Arial" w:cs="Arial"/>
+          <w:lang w:val="en-US" w:eastAsia="zh-CN"/>
+        </w:rPr>
+      </w:r>
+      <w:r/>
+    </w:p>
+    <w:p>
+      <w:pPr>
+        <w:rPr>
+          <w:rFonts w:ascii="Arial" w:hAnsi="Arial" w:cs="Arial"/>
+        </w:rPr>
+      </w:pPr>
       <w:r/>
     </w:p>
     <w:sectPr>
@@ -6584,7 +7488,7 @@
 <w:ftr xmlns:wpc="http://schemas.microsoft.com/office/word/2010/wordprocessingCanvas" xmlns:mc="http://schemas.openxmlformats.org/markup-compatibility/2006" xmlns:o="urn:schemas-microsoft-com:office:office" xmlns:r="http://schemas.openxmlformats.org/officeDocument/2006/relationships" xmlns:m="http://schemas.openxmlformats.org/officeDocument/2006/math" xmlns:v="urn:schemas-microsoft-com:vml" xmlns:wp14="http://schemas.microsoft.com/office/word/2010/wordprocessingDrawing" xmlns:wp="http://schemas.openxmlformats.org/drawingml/2006/wordprocessingDrawing" xmlns:w10="urn:schemas-microsoft-com:office:word" xmlns:w="http://schemas.openxmlformats.org/wordprocessingml/2006/main" xmlns:w14="http://schemas.microsoft.com/office/word/2010/wordml" xmlns:wpg="http://schemas.microsoft.com/office/word/2010/wordprocessingGroup" xmlns:wpi="http://schemas.microsoft.com/office/word/2010/wordprocessingInk" xmlns:wne="http://schemas.microsoft.com/office/word/2006/wordml" xmlns:a="http://schemas.openxmlformats.org/drawingml/2006/main" xmlns:wps="http://schemas.microsoft.com/office/word/2010/wordprocessingShape" mc:Ignorable="w14 wp14">
   <w:p>
     <w:pPr>
-      <w:pStyle w:val="184"/>
+      <w:pStyle w:val="217"/>
     </w:pPr>
     <w:r>
       <w:t xml:space="preserve">File Name</w:t>
@@ -6675,7 +7579,7 @@
   </w:p>
   <w:p>
     <w:pPr>
-      <w:pStyle w:val="184"/>
+      <w:pStyle w:val="217"/>
     </w:pPr>
     <w:r/>
     <w:r/>
@@ -6714,7 +7618,7 @@
 <w:hdr xmlns:wpc="http://schemas.microsoft.com/office/word/2010/wordprocessingCanvas" xmlns:mc="http://schemas.openxmlformats.org/markup-compatibility/2006" xmlns:o="urn:schemas-microsoft-com:office:office" xmlns:r="http://schemas.openxmlformats.org/officeDocument/2006/relationships" xmlns:m="http://schemas.openxmlformats.org/officeDocument/2006/math" xmlns:v="urn:schemas-microsoft-com:vml" xmlns:wp14="http://schemas.microsoft.com/office/word/2010/wordprocessingDrawing" xmlns:wp="http://schemas.openxmlformats.org/drawingml/2006/wordprocessingDrawing" xmlns:w10="urn:schemas-microsoft-com:office:word" xmlns:w="http://schemas.openxmlformats.org/wordprocessingml/2006/main" xmlns:w14="http://schemas.microsoft.com/office/word/2010/wordml" xmlns:wpg="http://schemas.microsoft.com/office/word/2010/wordprocessingGroup" xmlns:wpi="http://schemas.microsoft.com/office/word/2010/wordprocessingInk" xmlns:wne="http://schemas.microsoft.com/office/word/2006/wordml" xmlns:a="http://schemas.openxmlformats.org/drawingml/2006/main" xmlns:wps="http://schemas.microsoft.com/office/word/2010/wordprocessingShape" mc:Ignorable="w14 wp14">
   <w:p>
     <w:pPr>
-      <w:pStyle w:val="182"/>
+      <w:pStyle w:val="215"/>
       <w:spacing w:lineRule="auto" w:line="276" w:after="120"/>
       <w:tabs>
         <w:tab w:val="left" w:pos="2580" w:leader="none"/>
@@ -6767,7 +7671,7 @@
   </w:p>
   <w:p>
     <w:pPr>
-      <w:pStyle w:val="182"/>
+      <w:pStyle w:val="215"/>
       <w:spacing w:lineRule="auto" w:line="276" w:after="120"/>
       <w:tabs>
         <w:tab w:val="left" w:pos="2580" w:leader="none"/>
@@ -6854,7 +7758,7 @@
       <w:lvlText w:val=""/>
       <w:lvlJc w:val="left"/>
       <w:pPr>
-        <w:ind w:left="720" w:hanging="359"/>
+        <w:ind w:left="720" w:hanging="358"/>
       </w:pPr>
       <w:rPr>
         <w:rFonts w:ascii="Symbol" w:hAnsi="Symbol" w:hint="default"/>
@@ -6867,7 +7771,7 @@
       <w:lvlText w:val="o"/>
       <w:lvlJc w:val="left"/>
       <w:pPr>
-        <w:ind w:left="1440" w:hanging="359"/>
+        <w:ind w:left="1440" w:hanging="358"/>
       </w:pPr>
       <w:rPr>
         <w:rFonts w:ascii="Courier New" w:hAnsi="Courier New" w:cs="Courier New" w:hint="default"/>
@@ -6880,7 +7784,7 @@
       <w:lvlText w:val=""/>
       <w:lvlJc w:val="left"/>
       <w:pPr>
-        <w:ind w:left="2160" w:hanging="359"/>
+        <w:ind w:left="2160" w:hanging="358"/>
       </w:pPr>
       <w:rPr>
         <w:rFonts w:ascii="Wingdings" w:hAnsi="Wingdings" w:hint="default"/>
@@ -6893,7 +7797,7 @@
       <w:lvlText w:val=""/>
       <w:lvlJc w:val="left"/>
       <w:pPr>
-        <w:ind w:left="2880" w:hanging="359"/>
+        <w:ind w:left="2880" w:hanging="358"/>
       </w:pPr>
       <w:rPr>
         <w:rFonts w:ascii="Symbol" w:hAnsi="Symbol" w:hint="default"/>
@@ -6906,7 +7810,7 @@
       <w:lvlText w:val="o"/>
       <w:lvlJc w:val="left"/>
       <w:pPr>
-        <w:ind w:left="3600" w:hanging="359"/>
+        <w:ind w:left="3600" w:hanging="358"/>
       </w:pPr>
       <w:rPr>
         <w:rFonts w:ascii="Courier New" w:hAnsi="Courier New" w:cs="Courier New" w:hint="default"/>
@@ -6919,7 +7823,7 @@
       <w:lvlText w:val=""/>
       <w:lvlJc w:val="left"/>
       <w:pPr>
-        <w:ind w:left="4320" w:hanging="359"/>
+        <w:ind w:left="4320" w:hanging="358"/>
       </w:pPr>
       <w:rPr>
         <w:rFonts w:ascii="Wingdings" w:hAnsi="Wingdings" w:hint="default"/>
@@ -6932,7 +7836,7 @@
       <w:lvlText w:val=""/>
       <w:lvlJc w:val="left"/>
       <w:pPr>
-        <w:ind w:left="5040" w:hanging="359"/>
+        <w:ind w:left="5040" w:hanging="358"/>
       </w:pPr>
       <w:rPr>
         <w:rFonts w:ascii="Symbol" w:hAnsi="Symbol" w:hint="default"/>
@@ -6945,7 +7849,7 @@
       <w:lvlText w:val="o"/>
       <w:lvlJc w:val="left"/>
       <w:pPr>
-        <w:ind w:left="5760" w:hanging="359"/>
+        <w:ind w:left="5760" w:hanging="358"/>
       </w:pPr>
       <w:rPr>
         <w:rFonts w:ascii="Courier New" w:hAnsi="Courier New" w:cs="Courier New" w:hint="default"/>
@@ -6958,7 +7862,7 @@
       <w:lvlText w:val=""/>
       <w:lvlJc w:val="left"/>
       <w:pPr>
-        <w:ind w:left="6480" w:hanging="359"/>
+        <w:ind w:left="6480" w:hanging="358"/>
       </w:pPr>
       <w:rPr>
         <w:rFonts w:ascii="Wingdings" w:hAnsi="Wingdings" w:hint="default"/>
@@ -6970,100 +7874,100 @@
     <w:lvl w:ilvl="0">
       <w:start w:val="1"/>
       <w:numFmt w:val="decimal"/>
-      <w:pStyle w:val="170"/>
+      <w:pStyle w:val="203"/>
       <w:suff w:val="tab"/>
       <w:lvlText w:val="%1"/>
       <w:lvlJc w:val="left"/>
       <w:pPr>
-        <w:ind w:left="432" w:hanging="431"/>
+        <w:ind w:left="432" w:hanging="430"/>
       </w:pPr>
     </w:lvl>
     <w:lvl w:ilvl="1">
       <w:start w:val="1"/>
       <w:numFmt w:val="decimal"/>
-      <w:pStyle w:val="171"/>
+      <w:pStyle w:val="204"/>
       <w:suff w:val="tab"/>
       <w:lvlText w:val="%1.%2"/>
       <w:lvlJc w:val="left"/>
       <w:pPr>
-        <w:ind w:left="576" w:hanging="575"/>
+        <w:ind w:left="576" w:hanging="574"/>
       </w:pPr>
     </w:lvl>
     <w:lvl w:ilvl="2">
       <w:start w:val="1"/>
       <w:numFmt w:val="decimal"/>
-      <w:pStyle w:val="172"/>
+      <w:pStyle w:val="205"/>
       <w:suff w:val="tab"/>
       <w:lvlText w:val="%1.%2.%3"/>
       <w:lvlJc w:val="left"/>
       <w:pPr>
-        <w:ind w:left="720" w:hanging="719"/>
+        <w:ind w:left="720" w:hanging="718"/>
       </w:pPr>
     </w:lvl>
     <w:lvl w:ilvl="3">
       <w:start w:val="1"/>
       <w:numFmt w:val="decimal"/>
-      <w:pStyle w:val="173"/>
+      <w:pStyle w:val="206"/>
       <w:suff w:val="tab"/>
       <w:lvlText w:val="%1.%2.%3.%4"/>
       <w:lvlJc w:val="left"/>
       <w:pPr>
-        <w:ind w:left="864" w:hanging="863"/>
+        <w:ind w:left="864" w:hanging="862"/>
       </w:pPr>
     </w:lvl>
     <w:lvl w:ilvl="4">
       <w:start w:val="1"/>
       <w:numFmt w:val="decimal"/>
-      <w:pStyle w:val="174"/>
+      <w:pStyle w:val="207"/>
       <w:suff w:val="tab"/>
       <w:lvlText w:val="%1.%2.%3.%4.%5"/>
       <w:lvlJc w:val="left"/>
       <w:pPr>
-        <w:ind w:left="1008" w:hanging="1007"/>
+        <w:ind w:left="1008" w:hanging="1006"/>
       </w:pPr>
     </w:lvl>
     <w:lvl w:ilvl="5">
       <w:start w:val="1"/>
       <w:numFmt w:val="decimal"/>
-      <w:pStyle w:val="175"/>
+      <w:pStyle w:val="208"/>
       <w:suff w:val="tab"/>
       <w:lvlText w:val="%1.%2.%3.%4.%5.%6"/>
       <w:lvlJc w:val="left"/>
       <w:pPr>
-        <w:ind w:left="1152" w:hanging="1151"/>
+        <w:ind w:left="1152" w:hanging="1150"/>
       </w:pPr>
     </w:lvl>
     <w:lvl w:ilvl="6">
       <w:start w:val="1"/>
       <w:numFmt w:val="decimal"/>
-      <w:pStyle w:val="176"/>
+      <w:pStyle w:val="209"/>
       <w:suff w:val="tab"/>
       <w:lvlText w:val="%1.%2.%3.%4.%5.%6.%7"/>
       <w:lvlJc w:val="left"/>
       <w:pPr>
-        <w:ind w:left="1296" w:hanging="1295"/>
+        <w:ind w:left="1296" w:hanging="1294"/>
       </w:pPr>
     </w:lvl>
     <w:lvl w:ilvl="7">
       <w:start w:val="1"/>
       <w:numFmt w:val="decimal"/>
-      <w:pStyle w:val="177"/>
+      <w:pStyle w:val="210"/>
       <w:suff w:val="tab"/>
       <w:lvlText w:val="%1.%2.%3.%4.%5.%6.%7.%8"/>
       <w:lvlJc w:val="left"/>
       <w:pPr>
-        <w:ind w:left="1440" w:hanging="1439"/>
+        <w:ind w:left="1440" w:hanging="1438"/>
       </w:pPr>
     </w:lvl>
     <w:lvl w:ilvl="8">
       <w:start w:val="1"/>
       <w:numFmt w:val="decimal"/>
-      <w:pStyle w:val="178"/>
+      <w:pStyle w:val="211"/>
       <w:suff w:val="tab"/>
       <w:lvlText w:val="%1.%2.%3.%4.%5.%6.%7.%8.%9"/>
       <w:lvlJc w:val="left"/>
       <w:pPr>
-        <w:ind w:left="1584" w:hanging="1583"/>
+        <w:ind w:left="1584" w:hanging="1582"/>
       </w:pPr>
     </w:lvl>
   </w:abstractNum>
@@ -7076,7 +7980,7 @@
       <w:lvlText w:val=""/>
       <w:lvlJc w:val="left"/>
       <w:pPr>
-        <w:ind w:left="1440" w:hanging="359"/>
+        <w:ind w:left="1440" w:hanging="358"/>
       </w:pPr>
       <w:rPr>
         <w:rFonts w:ascii="Symbol" w:hAnsi="Symbol" w:hint="default"/>
@@ -7089,7 +7993,7 @@
       <w:lvlText w:val="o"/>
       <w:lvlJc w:val="left"/>
       <w:pPr>
-        <w:ind w:left="2160" w:hanging="359"/>
+        <w:ind w:left="2160" w:hanging="358"/>
       </w:pPr>
       <w:rPr>
         <w:rFonts w:ascii="Courier New" w:hAnsi="Courier New" w:cs="Courier New" w:hint="default"/>
@@ -7102,7 +8006,7 @@
       <w:lvlText w:val=""/>
       <w:lvlJc w:val="left"/>
       <w:pPr>
-        <w:ind w:left="2880" w:hanging="359"/>
+        <w:ind w:left="2880" w:hanging="358"/>
       </w:pPr>
       <w:rPr>
         <w:rFonts w:ascii="Wingdings" w:hAnsi="Wingdings" w:hint="default"/>
@@ -7115,7 +8019,7 @@
       <w:lvlText w:val=""/>
       <w:lvlJc w:val="left"/>
       <w:pPr>
-        <w:ind w:left="3600" w:hanging="359"/>
+        <w:ind w:left="3600" w:hanging="358"/>
       </w:pPr>
       <w:rPr>
         <w:rFonts w:ascii="Symbol" w:hAnsi="Symbol" w:hint="default"/>
@@ -7128,7 +8032,7 @@
       <w:lvlText w:val="o"/>
       <w:lvlJc w:val="left"/>
       <w:pPr>
-        <w:ind w:left="4320" w:hanging="359"/>
+        <w:ind w:left="4320" w:hanging="358"/>
       </w:pPr>
       <w:rPr>
         <w:rFonts w:ascii="Courier New" w:hAnsi="Courier New" w:cs="Courier New" w:hint="default"/>
@@ -7141,7 +8045,7 @@
       <w:lvlText w:val=""/>
       <w:lvlJc w:val="left"/>
       <w:pPr>
-        <w:ind w:left="5040" w:hanging="359"/>
+        <w:ind w:left="5040" w:hanging="358"/>
       </w:pPr>
       <w:rPr>
         <w:rFonts w:ascii="Wingdings" w:hAnsi="Wingdings" w:hint="default"/>
@@ -7154,7 +8058,7 @@
       <w:lvlText w:val=""/>
       <w:lvlJc w:val="left"/>
       <w:pPr>
-        <w:ind w:left="5760" w:hanging="359"/>
+        <w:ind w:left="5760" w:hanging="358"/>
       </w:pPr>
       <w:rPr>
         <w:rFonts w:ascii="Symbol" w:hAnsi="Symbol" w:hint="default"/>
@@ -7167,7 +8071,7 @@
       <w:lvlText w:val="o"/>
       <w:lvlJc w:val="left"/>
       <w:pPr>
-        <w:ind w:left="6480" w:hanging="359"/>
+        <w:ind w:left="6480" w:hanging="358"/>
       </w:pPr>
       <w:rPr>
         <w:rFonts w:ascii="Courier New" w:hAnsi="Courier New" w:cs="Courier New" w:hint="default"/>
@@ -7180,7 +8084,7 @@
       <w:lvlText w:val=""/>
       <w:lvlJc w:val="left"/>
       <w:pPr>
-        <w:ind w:left="7200" w:hanging="359"/>
+        <w:ind w:left="7200" w:hanging="358"/>
       </w:pPr>
       <w:rPr>
         <w:rFonts w:ascii="Wingdings" w:hAnsi="Wingdings" w:hint="default"/>
@@ -7368,10 +8272,10 @@
     <w:lsdException w:name="Bibliography" w:uiPriority="37"/>
     <w:lsdException w:name="TOC Heading" w:uiPriority="39" w:qFormat="1"/>
   </w:latentStyles>
-  <w:style w:type="paragraph" w:styleId="33">
+  <w:style w:type="paragraph" w:styleId="169">
     <w:name w:val="Subtitle"/>
-    <w:basedOn w:val="169"/>
-    <w:next w:val="169"/>
+    <w:basedOn w:val="202"/>
+    <w:next w:val="202"/>
     <w:qFormat/>
     <w:uiPriority w:val="11"/>
     <w:rPr>
@@ -7384,10 +8288,10 @@
       <w:outlineLvl w:val="0"/>
     </w:pPr>
   </w:style>
-  <w:style w:type="paragraph" w:styleId="34">
+  <w:style w:type="paragraph" w:styleId="170">
     <w:name w:val="Quote"/>
-    <w:basedOn w:val="169"/>
-    <w:next w:val="169"/>
+    <w:basedOn w:val="202"/>
+    <w:next w:val="202"/>
     <w:qFormat/>
     <w:uiPriority w:val="29"/>
     <w:rPr>
@@ -7403,10 +8307,10 @@
       </w:pBdr>
     </w:pPr>
   </w:style>
-  <w:style w:type="paragraph" w:styleId="35">
+  <w:style w:type="paragraph" w:styleId="171">
     <w:name w:val="Intense Quote"/>
-    <w:basedOn w:val="169"/>
-    <w:next w:val="169"/>
+    <w:basedOn w:val="202"/>
+    <w:next w:val="202"/>
     <w:qFormat/>
     <w:uiPriority w:val="30"/>
     <w:rPr>
@@ -7425,9 +8329,9 @@
       </w:pBdr>
     </w:pPr>
   </w:style>
-  <w:style w:type="table" w:styleId="39">
+  <w:style w:type="table" w:styleId="172">
     <w:name w:val="Lined"/>
-    <w:basedOn w:val="180"/>
+    <w:basedOn w:val="213"/>
     <w:uiPriority w:val="99"/>
     <w:rPr>
       <w:color w:val="404040"/>
@@ -7521,9 +8425,9 @@
       </w:tcPr>
     </w:tblStylePr>
   </w:style>
-  <w:style w:type="table" w:styleId="40">
+  <w:style w:type="table" w:styleId="173">
     <w:name w:val="Lined - Accent 1"/>
-    <w:basedOn w:val="180"/>
+    <w:basedOn w:val="213"/>
     <w:uiPriority w:val="99"/>
     <w:rPr>
       <w:color w:val="404040"/>
@@ -7617,9 +8521,9 @@
       </w:tcPr>
     </w:tblStylePr>
   </w:style>
-  <w:style w:type="table" w:styleId="41">
+  <w:style w:type="table" w:styleId="174">
     <w:name w:val="Lined - Accent 2"/>
-    <w:basedOn w:val="180"/>
+    <w:basedOn w:val="213"/>
     <w:uiPriority w:val="99"/>
     <w:rPr>
       <w:color w:val="404040"/>
@@ -7713,9 +8617,9 @@
       </w:tcPr>
     </w:tblStylePr>
   </w:style>
-  <w:style w:type="table" w:styleId="42">
+  <w:style w:type="table" w:styleId="175">
     <w:name w:val="Lined - Accent 3"/>
-    <w:basedOn w:val="180"/>
+    <w:basedOn w:val="213"/>
     <w:uiPriority w:val="99"/>
     <w:rPr>
       <w:color w:val="404040"/>
@@ -7809,9 +8713,9 @@
       </w:tcPr>
     </w:tblStylePr>
   </w:style>
-  <w:style w:type="table" w:styleId="43">
+  <w:style w:type="table" w:styleId="176">
     <w:name w:val="Lined - Accent 4"/>
-    <w:basedOn w:val="180"/>
+    <w:basedOn w:val="213"/>
     <w:uiPriority w:val="99"/>
     <w:rPr>
       <w:color w:val="404040"/>
@@ -7905,9 +8809,9 @@
       </w:tcPr>
     </w:tblStylePr>
   </w:style>
-  <w:style w:type="table" w:styleId="44">
+  <w:style w:type="table" w:styleId="177">
     <w:name w:val="Lined - Accent 5"/>
-    <w:basedOn w:val="180"/>
+    <w:basedOn w:val="213"/>
     <w:uiPriority w:val="99"/>
     <w:rPr>
       <w:color w:val="404040"/>
@@ -8001,9 +8905,9 @@
       </w:tcPr>
     </w:tblStylePr>
   </w:style>
-  <w:style w:type="table" w:styleId="45">
+  <w:style w:type="table" w:styleId="178">
     <w:name w:val="Lined - Accent 6"/>
-    <w:basedOn w:val="180"/>
+    <w:basedOn w:val="213"/>
     <w:uiPriority w:val="99"/>
     <w:rPr>
       <w:color w:val="404040"/>
@@ -8097,9 +9001,9 @@
       </w:tcPr>
     </w:tblStylePr>
   </w:style>
-  <w:style w:type="table" w:styleId="46">
+  <w:style w:type="table" w:styleId="179">
     <w:name w:val="Bordered"/>
-    <w:basedOn w:val="180"/>
+    <w:basedOn w:val="213"/>
     <w:uiPriority w:val="99"/>
     <w:pPr>
       <w:spacing w:lineRule="auto" w:line="240" w:after="0"/>
@@ -8187,9 +9091,9 @@
       </w:tcPr>
     </w:tblStylePr>
   </w:style>
-  <w:style w:type="table" w:styleId="47">
+  <w:style w:type="table" w:styleId="180">
     <w:name w:val="Bordered - Accent 1"/>
-    <w:basedOn w:val="180"/>
+    <w:basedOn w:val="213"/>
     <w:uiPriority w:val="99"/>
     <w:pPr>
       <w:spacing w:lineRule="auto" w:line="240" w:after="0"/>
@@ -8277,9 +9181,9 @@
       </w:tcPr>
     </w:tblStylePr>
   </w:style>
-  <w:style w:type="table" w:styleId="48">
+  <w:style w:type="table" w:styleId="181">
     <w:name w:val="Bordered - Accent 2"/>
-    <w:basedOn w:val="180"/>
+    <w:basedOn w:val="213"/>
     <w:uiPriority w:val="99"/>
     <w:pPr>
       <w:spacing w:lineRule="auto" w:line="240" w:after="0"/>
@@ -8367,9 +9271,9 @@
       </w:tcPr>
     </w:tblStylePr>
   </w:style>
-  <w:style w:type="table" w:styleId="49">
+  <w:style w:type="table" w:styleId="182">
     <w:name w:val="Bordered - Accent 3"/>
-    <w:basedOn w:val="180"/>
+    <w:basedOn w:val="213"/>
     <w:uiPriority w:val="99"/>
     <w:pPr>
       <w:spacing w:lineRule="auto" w:line="240" w:after="0"/>
@@ -8457,9 +9361,9 @@
       </w:tcPr>
     </w:tblStylePr>
   </w:style>
-  <w:style w:type="table" w:styleId="50">
+  <w:style w:type="table" w:styleId="183">
     <w:name w:val="Bordered - Accent 4"/>
-    <w:basedOn w:val="180"/>
+    <w:basedOn w:val="213"/>
     <w:uiPriority w:val="99"/>
     <w:pPr>
       <w:spacing w:lineRule="auto" w:line="240" w:after="0"/>
@@ -8547,9 +9451,9 @@
       </w:tcPr>
     </w:tblStylePr>
   </w:style>
-  <w:style w:type="table" w:styleId="51">
+  <w:style w:type="table" w:styleId="184">
     <w:name w:val="Bordered - Accent 5"/>
-    <w:basedOn w:val="180"/>
+    <w:basedOn w:val="213"/>
     <w:uiPriority w:val="99"/>
     <w:pPr>
       <w:spacing w:lineRule="auto" w:line="240" w:after="0"/>
@@ -8637,9 +9541,9 @@
       </w:tcPr>
     </w:tblStylePr>
   </w:style>
-  <w:style w:type="table" w:styleId="52">
+  <w:style w:type="table" w:styleId="185">
     <w:name w:val="Bordered - Accent 6"/>
-    <w:basedOn w:val="180"/>
+    <w:basedOn w:val="213"/>
     <w:uiPriority w:val="99"/>
     <w:pPr>
       <w:spacing w:lineRule="auto" w:line="240" w:after="0"/>
@@ -8727,9 +9631,9 @@
       </w:tcPr>
     </w:tblStylePr>
   </w:style>
-  <w:style w:type="table" w:styleId="53">
+  <w:style w:type="table" w:styleId="186">
     <w:name w:val="Bordered &amp; Lined"/>
-    <w:basedOn w:val="180"/>
+    <w:basedOn w:val="213"/>
     <w:uiPriority w:val="99"/>
     <w:rPr>
       <w:color w:val="404040"/>
@@ -8831,9 +9735,9 @@
       </w:tcPr>
     </w:tblStylePr>
   </w:style>
-  <w:style w:type="table" w:styleId="54">
+  <w:style w:type="table" w:styleId="187">
     <w:name w:val="Bordered &amp; Lined - Accent 1"/>
-    <w:basedOn w:val="180"/>
+    <w:basedOn w:val="213"/>
     <w:uiPriority w:val="99"/>
     <w:rPr>
       <w:color w:val="404040"/>
@@ -8935,9 +9839,9 @@
       </w:tcPr>
     </w:tblStylePr>
   </w:style>
-  <w:style w:type="table" w:styleId="55">
+  <w:style w:type="table" w:styleId="188">
     <w:name w:val="Bordered &amp; Lined - Accent 2"/>
-    <w:basedOn w:val="180"/>
+    <w:basedOn w:val="213"/>
     <w:uiPriority w:val="99"/>
     <w:rPr>
       <w:color w:val="404040"/>
@@ -9039,9 +9943,9 @@
       </w:tcPr>
     </w:tblStylePr>
   </w:style>
-  <w:style w:type="table" w:styleId="56">
+  <w:style w:type="table" w:styleId="189">
     <w:name w:val="Bordered &amp; Lined - Accent 3"/>
-    <w:basedOn w:val="180"/>
+    <w:basedOn w:val="213"/>
     <w:uiPriority w:val="99"/>
     <w:rPr>
       <w:color w:val="404040"/>
@@ -9143,9 +10047,9 @@
       </w:tcPr>
     </w:tblStylePr>
   </w:style>
-  <w:style w:type="table" w:styleId="57">
+  <w:style w:type="table" w:styleId="190">
     <w:name w:val="Bordered &amp; Lined - Accent 4"/>
-    <w:basedOn w:val="180"/>
+    <w:basedOn w:val="213"/>
     <w:uiPriority w:val="99"/>
     <w:rPr>
       <w:color w:val="404040"/>
@@ -9247,9 +10151,9 @@
       </w:tcPr>
     </w:tblStylePr>
   </w:style>
-  <w:style w:type="table" w:styleId="58">
+  <w:style w:type="table" w:styleId="191">
     <w:name w:val="Bordered &amp; Lined - Accent 5"/>
-    <w:basedOn w:val="180"/>
+    <w:basedOn w:val="213"/>
     <w:uiPriority w:val="99"/>
     <w:rPr>
       <w:color w:val="404040"/>
@@ -9351,9 +10255,9 @@
       </w:tcPr>
     </w:tblStylePr>
   </w:style>
-  <w:style w:type="table" w:styleId="59">
+  <w:style w:type="table" w:styleId="192">
     <w:name w:val="Bordered &amp; Lined - Accent 6"/>
-    <w:basedOn w:val="180"/>
+    <w:basedOn w:val="213"/>
     <w:uiPriority w:val="99"/>
     <w:rPr>
       <w:color w:val="404040"/>
@@ -9455,9 +10359,9 @@
       </w:tcPr>
     </w:tblStylePr>
   </w:style>
-  <w:style w:type="paragraph" w:styleId="61">
+  <w:style w:type="paragraph" w:styleId="193">
     <w:name w:val="footnote text"/>
-    <w:basedOn w:val="169"/>
+    <w:basedOn w:val="202"/>
     <w:uiPriority w:val="99"/>
     <w:semiHidden/>
     <w:unhideWhenUsed/>
@@ -9468,18 +10372,18 @@
       <w:spacing w:lineRule="auto" w:line="240" w:after="0"/>
     </w:pPr>
   </w:style>
-  <w:style w:type="character" w:styleId="62">
+  <w:style w:type="character" w:styleId="194">
     <w:name w:val="Footnote Text Char"/>
-    <w:basedOn w:val="179"/>
+    <w:basedOn w:val="212"/>
     <w:uiPriority w:val="99"/>
     <w:semiHidden/>
     <w:rPr>
       <w:sz w:val="20"/>
     </w:rPr>
   </w:style>
-  <w:style w:type="character" w:styleId="63">
+  <w:style w:type="character" w:styleId="195">
     <w:name w:val="footnote reference"/>
-    <w:basedOn w:val="179"/>
+    <w:basedOn w:val="212"/>
     <w:uiPriority w:val="99"/>
     <w:semiHidden/>
     <w:unhideWhenUsed/>
@@ -9487,10 +10391,10 @@
       <w:vertAlign w:val="superscript"/>
     </w:rPr>
   </w:style>
-  <w:style w:type="paragraph" w:styleId="67">
+  <w:style w:type="paragraph" w:styleId="196">
     <w:name w:val="toc 4"/>
-    <w:basedOn w:val="169"/>
-    <w:next w:val="169"/>
+    <w:basedOn w:val="202"/>
+    <w:next w:val="202"/>
     <w:uiPriority w:val="39"/>
     <w:unhideWhenUsed/>
     <w:pPr>
@@ -9498,10 +10402,10 @@
       <w:spacing w:after="57"/>
     </w:pPr>
   </w:style>
-  <w:style w:type="paragraph" w:styleId="68">
+  <w:style w:type="paragraph" w:styleId="197">
     <w:name w:val="toc 5"/>
-    <w:basedOn w:val="169"/>
-    <w:next w:val="169"/>
+    <w:basedOn w:val="202"/>
+    <w:next w:val="202"/>
     <w:uiPriority w:val="39"/>
     <w:unhideWhenUsed/>
     <w:pPr>
@@ -9509,10 +10413,10 @@
       <w:spacing w:after="57"/>
     </w:pPr>
   </w:style>
-  <w:style w:type="paragraph" w:styleId="69">
+  <w:style w:type="paragraph" w:styleId="198">
     <w:name w:val="toc 6"/>
-    <w:basedOn w:val="169"/>
-    <w:next w:val="169"/>
+    <w:basedOn w:val="202"/>
+    <w:next w:val="202"/>
     <w:uiPriority w:val="39"/>
     <w:unhideWhenUsed/>
     <w:pPr>
@@ -9520,10 +10424,10 @@
       <w:spacing w:after="57"/>
     </w:pPr>
   </w:style>
-  <w:style w:type="paragraph" w:styleId="70">
+  <w:style w:type="paragraph" w:styleId="199">
     <w:name w:val="toc 7"/>
-    <w:basedOn w:val="169"/>
-    <w:next w:val="169"/>
+    <w:basedOn w:val="202"/>
+    <w:next w:val="202"/>
     <w:uiPriority w:val="39"/>
     <w:unhideWhenUsed/>
     <w:pPr>
@@ -9531,10 +10435,10 @@
       <w:spacing w:after="57"/>
     </w:pPr>
   </w:style>
-  <w:style w:type="paragraph" w:styleId="71">
+  <w:style w:type="paragraph" w:styleId="200">
     <w:name w:val="toc 8"/>
-    <w:basedOn w:val="169"/>
-    <w:next w:val="169"/>
+    <w:basedOn w:val="202"/>
+    <w:next w:val="202"/>
     <w:uiPriority w:val="39"/>
     <w:unhideWhenUsed/>
     <w:pPr>
@@ -9542,10 +10446,10 @@
       <w:spacing w:after="57"/>
     </w:pPr>
   </w:style>
-  <w:style w:type="paragraph" w:styleId="72">
+  <w:style w:type="paragraph" w:styleId="201">
     <w:name w:val="toc 9"/>
-    <w:basedOn w:val="169"/>
-    <w:next w:val="169"/>
+    <w:basedOn w:val="202"/>
+    <w:next w:val="202"/>
     <w:uiPriority w:val="39"/>
     <w:unhideWhenUsed/>
     <w:pPr>
@@ -9553,14 +10457,14 @@
       <w:spacing w:after="57"/>
     </w:pPr>
   </w:style>
-  <w:style w:type="paragraph" w:styleId="169" w:default="1">
+  <w:style w:type="paragraph" w:styleId="202" w:default="1">
     <w:name w:val="Normal"/>
     <w:qFormat/>
   </w:style>
-  <w:style w:type="paragraph" w:styleId="170">
+  <w:style w:type="paragraph" w:styleId="203">
     <w:name w:val="Heading 1"/>
-    <w:basedOn w:val="169"/>
-    <w:next w:val="169"/>
+    <w:basedOn w:val="202"/>
+    <w:next w:val="202"/>
     <w:qFormat/>
     <w:uiPriority w:val="9"/>
     <w:rPr>
@@ -9580,10 +10484,10 @@
       <w:outlineLvl w:val="0"/>
     </w:pPr>
   </w:style>
-  <w:style w:type="paragraph" w:styleId="171">
+  <w:style w:type="paragraph" w:styleId="204">
     <w:name w:val="Heading 2"/>
-    <w:basedOn w:val="169"/>
-    <w:next w:val="169"/>
+    <w:basedOn w:val="202"/>
+    <w:next w:val="202"/>
     <w:qFormat/>
     <w:uiPriority w:val="9"/>
     <w:unhideWhenUsed/>
@@ -9605,10 +10509,10 @@
       <w:outlineLvl w:val="1"/>
     </w:pPr>
   </w:style>
-  <w:style w:type="paragraph" w:styleId="172">
+  <w:style w:type="paragraph" w:styleId="205">
     <w:name w:val="Heading 3"/>
-    <w:basedOn w:val="169"/>
-    <w:next w:val="169"/>
+    <w:basedOn w:val="202"/>
+    <w:next w:val="202"/>
     <w:qFormat/>
     <w:uiPriority w:val="9"/>
     <w:unhideWhenUsed/>
@@ -9628,10 +10532,10 @@
       <w:outlineLvl w:val="2"/>
     </w:pPr>
   </w:style>
-  <w:style w:type="paragraph" w:styleId="173">
+  <w:style w:type="paragraph" w:styleId="206">
     <w:name w:val="Heading 4"/>
-    <w:basedOn w:val="169"/>
-    <w:next w:val="169"/>
+    <w:basedOn w:val="202"/>
+    <w:next w:val="202"/>
     <w:qFormat/>
     <w:uiPriority w:val="9"/>
     <w:semiHidden/>
@@ -9655,10 +10559,10 @@
       <w:outlineLvl w:val="3"/>
     </w:pPr>
   </w:style>
-  <w:style w:type="paragraph" w:styleId="174">
+  <w:style w:type="paragraph" w:styleId="207">
     <w:name w:val="Heading 5"/>
-    <w:basedOn w:val="169"/>
-    <w:next w:val="169"/>
+    <w:basedOn w:val="202"/>
+    <w:next w:val="202"/>
     <w:qFormat/>
     <w:uiPriority w:val="9"/>
     <w:semiHidden/>
@@ -9678,10 +10582,10 @@
       <w:outlineLvl w:val="4"/>
     </w:pPr>
   </w:style>
-  <w:style w:type="paragraph" w:styleId="175">
+  <w:style w:type="paragraph" w:styleId="208">
     <w:name w:val="Heading 6"/>
-    <w:basedOn w:val="169"/>
-    <w:next w:val="169"/>
+    <w:basedOn w:val="202"/>
+    <w:next w:val="202"/>
     <w:qFormat/>
     <w:uiPriority w:val="9"/>
     <w:semiHidden/>
@@ -9703,10 +10607,10 @@
       <w:outlineLvl w:val="5"/>
     </w:pPr>
   </w:style>
-  <w:style w:type="paragraph" w:styleId="176">
+  <w:style w:type="paragraph" w:styleId="209">
     <w:name w:val="Heading 7"/>
-    <w:basedOn w:val="169"/>
-    <w:next w:val="169"/>
+    <w:basedOn w:val="202"/>
+    <w:next w:val="202"/>
     <w:qFormat/>
     <w:uiPriority w:val="9"/>
     <w:semiHidden/>
@@ -9728,10 +10632,10 @@
       <w:outlineLvl w:val="6"/>
     </w:pPr>
   </w:style>
-  <w:style w:type="paragraph" w:styleId="177">
+  <w:style w:type="paragraph" w:styleId="210">
     <w:name w:val="Heading 8"/>
-    <w:basedOn w:val="169"/>
-    <w:next w:val="169"/>
+    <w:basedOn w:val="202"/>
+    <w:next w:val="202"/>
     <w:qFormat/>
     <w:uiPriority w:val="9"/>
     <w:semiHidden/>
@@ -9753,10 +10657,10 @@
       <w:outlineLvl w:val="7"/>
     </w:pPr>
   </w:style>
-  <w:style w:type="paragraph" w:styleId="178">
+  <w:style w:type="paragraph" w:styleId="211">
     <w:name w:val="Heading 9"/>
-    <w:basedOn w:val="169"/>
-    <w:next w:val="169"/>
+    <w:basedOn w:val="202"/>
+    <w:next w:val="202"/>
     <w:qFormat/>
     <w:uiPriority w:val="9"/>
     <w:semiHidden/>
@@ -9780,13 +10684,13 @@
       <w:outlineLvl w:val="8"/>
     </w:pPr>
   </w:style>
-  <w:style w:type="character" w:styleId="179" w:default="1">
+  <w:style w:type="character" w:styleId="212" w:default="1">
     <w:name w:val="Default Paragraph Font"/>
     <w:uiPriority w:val="1"/>
     <w:semiHidden/>
     <w:unhideWhenUsed/>
   </w:style>
-  <w:style w:type="table" w:styleId="180" w:default="1">
+  <w:style w:type="table" w:styleId="213" w:default="1">
     <w:name w:val="Normal Table"/>
     <w:uiPriority w:val="99"/>
     <w:semiHidden/>
@@ -9801,15 +10705,15 @@
       </w:tblCellMar>
     </w:tblPr>
   </w:style>
-  <w:style w:type="numbering" w:styleId="181" w:default="1">
+  <w:style w:type="numbering" w:styleId="214" w:default="1">
     <w:name w:val="No List"/>
     <w:uiPriority w:val="99"/>
     <w:semiHidden/>
     <w:unhideWhenUsed/>
   </w:style>
-  <w:style w:type="paragraph" w:styleId="182">
+  <w:style w:type="paragraph" w:styleId="215">
     <w:name w:val="Header"/>
-    <w:basedOn w:val="169"/>
+    <w:basedOn w:val="202"/>
     <w:uiPriority w:val="99"/>
     <w:unhideWhenUsed/>
     <w:pPr>
@@ -9820,14 +10724,14 @@
       </w:tabs>
     </w:pPr>
   </w:style>
-  <w:style w:type="character" w:styleId="183">
+  <w:style w:type="character" w:styleId="216">
     <w:name w:val="Header Char"/>
-    <w:basedOn w:val="179"/>
+    <w:basedOn w:val="212"/>
     <w:uiPriority w:val="99"/>
   </w:style>
-  <w:style w:type="paragraph" w:styleId="184">
+  <w:style w:type="paragraph" w:styleId="217">
     <w:name w:val="Footer"/>
-    <w:basedOn w:val="169"/>
+    <w:basedOn w:val="202"/>
     <w:uiPriority w:val="99"/>
     <w:unhideWhenUsed/>
     <w:pPr>
@@ -9838,12 +10742,12 @@
       </w:tabs>
     </w:pPr>
   </w:style>
-  <w:style w:type="character" w:styleId="185">
+  <w:style w:type="character" w:styleId="218">
     <w:name w:val="Footer Char"/>
-    <w:basedOn w:val="179"/>
+    <w:basedOn w:val="212"/>
     <w:uiPriority w:val="99"/>
   </w:style>
-  <w:style w:type="paragraph" w:styleId="186">
+  <w:style w:type="paragraph" w:styleId="219">
     <w:name w:val="No Spacing"/>
     <w:qFormat/>
     <w:uiPriority w:val="1"/>
@@ -9851,17 +10755,17 @@
       <w:spacing w:lineRule="auto" w:line="240" w:after="0"/>
     </w:pPr>
   </w:style>
-  <w:style w:type="character" w:styleId="187">
+  <w:style w:type="character" w:styleId="220">
     <w:name w:val="No Spacing Char"/>
-    <w:basedOn w:val="179"/>
+    <w:basedOn w:val="212"/>
     <w:uiPriority w:val="1"/>
     <w:rPr>
       <w:lang w:val="en-US" w:eastAsia="en-US"/>
     </w:rPr>
   </w:style>
-  <w:style w:type="paragraph" w:styleId="188">
+  <w:style w:type="paragraph" w:styleId="221">
     <w:name w:val="Balloon Text"/>
-    <w:basedOn w:val="169"/>
+    <w:basedOn w:val="202"/>
     <w:uiPriority w:val="99"/>
     <w:semiHidden/>
     <w:unhideWhenUsed/>
@@ -9874,9 +10778,9 @@
       <w:spacing w:lineRule="auto" w:line="240" w:after="0"/>
     </w:pPr>
   </w:style>
-  <w:style w:type="character" w:styleId="189">
+  <w:style w:type="character" w:styleId="222">
     <w:name w:val="Balloon Text Char"/>
-    <w:basedOn w:val="179"/>
+    <w:basedOn w:val="212"/>
     <w:uiPriority w:val="99"/>
     <w:semiHidden/>
     <w:rPr>
@@ -9885,9 +10789,9 @@
       <w:szCs w:val="16"/>
     </w:rPr>
   </w:style>
-  <w:style w:type="paragraph" w:styleId="190">
+  <w:style w:type="paragraph" w:styleId="223">
     <w:name w:val="Title"/>
-    <w:basedOn w:val="169"/>
+    <w:basedOn w:val="202"/>
     <w:qFormat/>
     <w:rPr>
       <w:rFonts w:ascii="Tahoma" w:hAnsi="Tahoma" w:cs="Times New Roman" w:eastAsia="Times New Roman"/>
@@ -9899,9 +10803,9 @@
       <w:spacing w:lineRule="auto" w:line="240" w:after="60" w:before="120"/>
     </w:pPr>
   </w:style>
-  <w:style w:type="character" w:styleId="191">
+  <w:style w:type="character" w:styleId="224">
     <w:name w:val="Title Char"/>
-    <w:basedOn w:val="179"/>
+    <w:basedOn w:val="212"/>
     <w:rPr>
       <w:rFonts w:ascii="Tahoma" w:hAnsi="Tahoma" w:cs="Times New Roman" w:eastAsia="Times New Roman"/>
       <w:bCs/>
@@ -9910,12 +10814,12 @@
       <w:lang w:eastAsia="en-US"/>
     </w:rPr>
   </w:style>
-  <w:style w:type="paragraph" w:styleId="192">
+  <w:style w:type="paragraph" w:styleId="225">
     <w:name w:val="Table Text"/>
-    <w:basedOn w:val="169"/>
+    <w:basedOn w:val="202"/>
     <w:rPr>
       <w:rFonts w:ascii="Arial" w:hAnsi="Arial" w:cs="Times New Roman" w:eastAsia="Times New Roman"/>
-      <w:spacing w:val="-4"/>
+      <w:spacing w:val="-3"/>
       <w:sz w:val="16"/>
       <w:szCs w:val="20"/>
       <w:lang w:val="en-GB"/>
@@ -9924,13 +10828,13 @@
       <w:spacing w:lineRule="auto" w:line="240" w:after="60" w:before="60"/>
     </w:pPr>
   </w:style>
-  <w:style w:type="paragraph" w:styleId="193">
+  <w:style w:type="paragraph" w:styleId="226">
     <w:name w:val="Table Text Header Centered"/>
-    <w:basedOn w:val="169"/>
+    <w:basedOn w:val="202"/>
     <w:rPr>
       <w:rFonts w:ascii="Tahoma" w:hAnsi="Tahoma" w:cs="Times New Roman" w:eastAsia="Times New Roman"/>
       <w:color w:val="FFFFFF"/>
-      <w:spacing w:val="-4"/>
+      <w:spacing w:val="-3"/>
       <w:sz w:val="16"/>
       <w:szCs w:val="16"/>
       <w:lang w:val="en-GB"/>
@@ -9940,9 +10844,9 @@
       <w:spacing w:lineRule="auto" w:line="240" w:after="120" w:before="120"/>
     </w:pPr>
   </w:style>
-  <w:style w:type="table" w:styleId="194">
+  <w:style w:type="table" w:styleId="227">
     <w:name w:val="Table Grid"/>
-    <w:basedOn w:val="180"/>
+    <w:basedOn w:val="213"/>
     <w:uiPriority w:val="59"/>
     <w:rPr>
       <w:rFonts w:ascii="Arial" w:hAnsi="Arial"/>
@@ -9975,9 +10879,9 @@
       </w:tcPr>
     </w:tblStylePr>
   </w:style>
-  <w:style w:type="table" w:styleId="195">
+  <w:style w:type="table" w:styleId="228">
     <w:name w:val="Style1"/>
-    <w:basedOn w:val="180"/>
+    <w:basedOn w:val="213"/>
     <w:qFormat/>
     <w:uiPriority w:val="99"/>
     <w:rPr>
@@ -9988,9 +10892,9 @@
     </w:pPr>
     <w:tblPr/>
   </w:style>
-  <w:style w:type="table" w:styleId="196">
+  <w:style w:type="table" w:styleId="229">
     <w:name w:val="BA Style"/>
-    <w:basedOn w:val="180"/>
+    <w:basedOn w:val="213"/>
     <w:qFormat/>
     <w:uiPriority w:val="99"/>
     <w:rPr>
@@ -10001,18 +10905,18 @@
     </w:pPr>
     <w:tblPr/>
   </w:style>
-  <w:style w:type="character" w:styleId="197">
+  <w:style w:type="character" w:styleId="230">
     <w:name w:val="Placeholder Text"/>
-    <w:basedOn w:val="179"/>
+    <w:basedOn w:val="212"/>
     <w:uiPriority w:val="99"/>
     <w:semiHidden/>
     <w:rPr>
       <w:color w:val="808080"/>
     </w:rPr>
   </w:style>
-  <w:style w:type="character" w:styleId="198">
+  <w:style w:type="character" w:styleId="231">
     <w:name w:val="Heading 1 Char"/>
-    <w:basedOn w:val="179"/>
+    <w:basedOn w:val="212"/>
     <w:uiPriority w:val="9"/>
     <w:rPr>
       <w:rFonts w:ascii="Arial" w:hAnsi="Arial" w:cs="Cambria" w:eastAsia="Cambria"/>
@@ -10022,9 +10926,9 @@
       <w:szCs w:val="28"/>
     </w:rPr>
   </w:style>
-  <w:style w:type="character" w:styleId="199">
+  <w:style w:type="character" w:styleId="232">
     <w:name w:val="Heading 2 Char"/>
-    <w:basedOn w:val="179"/>
+    <w:basedOn w:val="212"/>
     <w:uiPriority w:val="9"/>
     <w:rPr>
       <w:rFonts w:ascii="Arial" w:hAnsi="Arial" w:cs="Cambria" w:eastAsia="Cambria"/>
@@ -10034,18 +10938,18 @@
       <w:szCs w:val="26"/>
     </w:rPr>
   </w:style>
-  <w:style w:type="character" w:styleId="200">
+  <w:style w:type="character" w:styleId="233">
     <w:name w:val="Heading 3 Char"/>
-    <w:basedOn w:val="179"/>
+    <w:basedOn w:val="212"/>
     <w:uiPriority w:val="9"/>
     <w:rPr>
       <w:rFonts w:ascii="Arial" w:hAnsi="Arial" w:cs="Cambria" w:eastAsia="Cambria"/>
       <w:bCs/>
     </w:rPr>
   </w:style>
-  <w:style w:type="character" w:styleId="201">
+  <w:style w:type="character" w:styleId="234">
     <w:name w:val="Heading 4 Char"/>
-    <w:basedOn w:val="179"/>
+    <w:basedOn w:val="212"/>
     <w:uiPriority w:val="9"/>
     <w:semiHidden/>
     <w:rPr>
@@ -10057,9 +10961,9 @@
       <w:color w:val="4F81BD" w:themeColor="accent1"/>
     </w:rPr>
   </w:style>
-  <w:style w:type="character" w:styleId="202">
+  <w:style w:type="character" w:styleId="235">
     <w:name w:val="Heading 5 Char"/>
-    <w:basedOn w:val="179"/>
+    <w:basedOn w:val="212"/>
     <w:uiPriority w:val="9"/>
     <w:semiHidden/>
     <w:rPr>
@@ -10067,9 +10971,9 @@
       <w:color w:val="243F60" w:themeColor="accent1" w:themeShade="7F"/>
     </w:rPr>
   </w:style>
-  <w:style w:type="character" w:styleId="203">
+  <w:style w:type="character" w:styleId="236">
     <w:name w:val="Heading 6 Char"/>
-    <w:basedOn w:val="179"/>
+    <w:basedOn w:val="212"/>
     <w:uiPriority w:val="9"/>
     <w:semiHidden/>
     <w:rPr>
@@ -10079,9 +10983,9 @@
       <w:color w:val="243F60" w:themeColor="accent1" w:themeShade="7F"/>
     </w:rPr>
   </w:style>
-  <w:style w:type="character" w:styleId="204">
+  <w:style w:type="character" w:styleId="237">
     <w:name w:val="Heading 7 Char"/>
-    <w:basedOn w:val="179"/>
+    <w:basedOn w:val="212"/>
     <w:uiPriority w:val="9"/>
     <w:semiHidden/>
     <w:rPr>
@@ -10091,9 +10995,9 @@
       <w:color w:val="404040" w:themeColor="text1" w:themeTint="BF"/>
     </w:rPr>
   </w:style>
-  <w:style w:type="character" w:styleId="205">
+  <w:style w:type="character" w:styleId="238">
     <w:name w:val="Heading 8 Char"/>
-    <w:basedOn w:val="179"/>
+    <w:basedOn w:val="212"/>
     <w:uiPriority w:val="9"/>
     <w:semiHidden/>
     <w:rPr>
@@ -10103,9 +11007,9 @@
       <w:szCs w:val="20"/>
     </w:rPr>
   </w:style>
-  <w:style w:type="character" w:styleId="206">
+  <w:style w:type="character" w:styleId="239">
     <w:name w:val="Heading 9 Char"/>
-    <w:basedOn w:val="179"/>
+    <w:basedOn w:val="212"/>
     <w:uiPriority w:val="9"/>
     <w:semiHidden/>
     <w:rPr>
@@ -10117,10 +11021,10 @@
       <w:szCs w:val="20"/>
     </w:rPr>
   </w:style>
-  <w:style w:type="paragraph" w:styleId="207">
+  <w:style w:type="paragraph" w:styleId="240">
     <w:name w:val="InfoBlue"/>
-    <w:basedOn w:val="169"/>
-    <w:next w:val="208"/>
+    <w:basedOn w:val="202"/>
+    <w:next w:val="241"/>
     <w:rPr>
       <w:rFonts w:ascii="Times New Roman" w:hAnsi="Times New Roman" w:cs="Times New Roman" w:eastAsia="Times New Roman"/>
       <w:i/>
@@ -10138,9 +11042,9 @@
       </w:tabs>
     </w:pPr>
   </w:style>
-  <w:style w:type="paragraph" w:styleId="208">
+  <w:style w:type="paragraph" w:styleId="241">
     <w:name w:val="Body Text"/>
-    <w:basedOn w:val="169"/>
+    <w:basedOn w:val="202"/>
     <w:uiPriority w:val="99"/>
     <w:semiHidden/>
     <w:unhideWhenUsed/>
@@ -10148,16 +11052,16 @@
       <w:spacing w:after="120"/>
     </w:pPr>
   </w:style>
-  <w:style w:type="character" w:styleId="209">
+  <w:style w:type="character" w:styleId="242">
     <w:name w:val="Body Text Char"/>
-    <w:basedOn w:val="179"/>
+    <w:basedOn w:val="212"/>
     <w:uiPriority w:val="99"/>
     <w:semiHidden/>
   </w:style>
-  <w:style w:type="paragraph" w:styleId="210">
+  <w:style w:type="paragraph" w:styleId="243">
     <w:name w:val="TOC Heading"/>
-    <w:basedOn w:val="170"/>
-    <w:next w:val="169"/>
+    <w:basedOn w:val="203"/>
+    <w:next w:val="202"/>
     <w:qFormat/>
     <w:uiPriority w:val="39"/>
     <w:semiHidden/>
@@ -10173,20 +11077,20 @@
       <w:outlineLvl w:val="9"/>
     </w:pPr>
   </w:style>
-  <w:style w:type="paragraph" w:styleId="211">
+  <w:style w:type="paragraph" w:styleId="244">
     <w:name w:val="toc 1"/>
-    <w:basedOn w:val="169"/>
-    <w:next w:val="169"/>
+    <w:basedOn w:val="202"/>
+    <w:next w:val="202"/>
     <w:uiPriority w:val="39"/>
     <w:unhideWhenUsed/>
     <w:pPr>
       <w:spacing w:after="100"/>
     </w:pPr>
   </w:style>
-  <w:style w:type="paragraph" w:styleId="212">
+  <w:style w:type="paragraph" w:styleId="245">
     <w:name w:val="toc 2"/>
-    <w:basedOn w:val="169"/>
-    <w:next w:val="169"/>
+    <w:basedOn w:val="202"/>
+    <w:next w:val="202"/>
     <w:uiPriority w:val="39"/>
     <w:unhideWhenUsed/>
     <w:pPr>
@@ -10194,10 +11098,10 @@
       <w:spacing w:after="100"/>
     </w:pPr>
   </w:style>
-  <w:style w:type="paragraph" w:styleId="213">
+  <w:style w:type="paragraph" w:styleId="246">
     <w:name w:val="toc 3"/>
-    <w:basedOn w:val="169"/>
-    <w:next w:val="169"/>
+    <w:basedOn w:val="202"/>
+    <w:next w:val="202"/>
     <w:uiPriority w:val="39"/>
     <w:unhideWhenUsed/>
     <w:pPr>
@@ -10205,9 +11109,9 @@
       <w:spacing w:after="100"/>
     </w:pPr>
   </w:style>
-  <w:style w:type="character" w:styleId="214">
+  <w:style w:type="character" w:styleId="247">
     <w:name w:val="Hyperlink"/>
-    <w:basedOn w:val="179"/>
+    <w:basedOn w:val="212"/>
     <w:uiPriority w:val="99"/>
     <w:unhideWhenUsed/>
     <w:rPr>
@@ -10215,10 +11119,10 @@
       <w:u w:val="single"/>
     </w:rPr>
   </w:style>
-  <w:style w:type="paragraph" w:styleId="215">
+  <w:style w:type="paragraph" w:styleId="248">
     <w:name w:val="caption"/>
-    <w:basedOn w:val="169"/>
-    <w:next w:val="169"/>
+    <w:basedOn w:val="202"/>
+    <w:next w:val="202"/>
     <w:qFormat/>
     <w:uiPriority w:val="35"/>
     <w:unhideWhenUsed/>
@@ -10234,9 +11138,9 @@
       <w:spacing w:lineRule="auto" w:line="240"/>
     </w:pPr>
   </w:style>
-  <w:style w:type="paragraph" w:styleId="216">
+  <w:style w:type="paragraph" w:styleId="249">
     <w:name w:val="List Paragraph"/>
-    <w:basedOn w:val="169"/>
+    <w:basedOn w:val="202"/>
     <w:qFormat/>
     <w:uiPriority w:val="34"/>
     <w:pPr>
@@ -10244,9 +11148,9 @@
       <w:ind w:left="720"/>
     </w:pPr>
   </w:style>
-  <w:style w:type="character" w:styleId="217">
+  <w:style w:type="character" w:styleId="250">
     <w:name w:val="FollowedHyperlink"/>
-    <w:basedOn w:val="179"/>
+    <w:basedOn w:val="212"/>
     <w:uiPriority w:val="99"/>
     <w:semiHidden/>
     <w:unhideWhenUsed/>

</xml_diff>